<commit_message>
grace(plan): GRACE-DOCX v3 — full planning artifacts + Docusaurus-first ordering
- Add GRACE planning artifacts: requirements.xml, technology.xml,
  verification-plan.xml, operational-packets.xml
- Update development-plan.xml with M-SIDEBAR + M-DISCOVERY modules
- Update knowledge-graph.xml with DocChapters and cross-links
- Add GRACE skills (.kilocode/skills/grace/)
- Add unit tests for discovery, renderer, grace_injector, graph_sync
- Add integration test for docx_builder
- Remove .cursor/rules/ in favor of GRACE methodology
- Add .openpackage/ config
- Update .gitignore with Python __pycache__/ exclusion
- Add .markdownlintignore and .cspell.json ignore for skill files
</commit_message>
<xml_diff>
--- a/GRACE_Стандарты_разработки.docx
+++ b/GRACE_Стандарты_разработки.docx
@@ -91,921 +91,3627 @@
     <w:p>
       <w:pPr>
         <w:ind w:left="0"/>
-      </w:pPr>
+        <w:tabs>
+          <w:tab w:val="right" w:leader="dot" w:pos="9072"/>
+        </w:tabs>
+      </w:pPr>
+      <w:hyperlink w:anchor="GRACE_M-INTRO">
+        <w:r>
+          <w:rPr>
+            <w:sz w:val="24"/>
+            <w:szCs w:val="24"/>
+            <w:rFonts w:ascii="Calibri" w:hAnsi="Calibri"/>
+            <w:b/>
+            <w:color w:val="1F3A5F"/>
+            <w:u w:val="single"/>
+          </w:rPr>
+          <w:t xml:space="preserve">Введение</w:t>
+        </w:r>
+      </w:hyperlink>
+      <w:r>
+        <w:tab/>
+      </w:r>
+      <w:r>
+        <w:fldChar w:fldCharType="begin"/>
+      </w:r>
+      <w:r>
+        <w:instrText xml:space="preserve"> PAGEREF GRACE_M-INTRO \h </w:instrText>
+      </w:r>
+      <w:r>
+        <w:fldChar w:fldCharType="separate"/>
+      </w:r>
       <w:r>
         <w:rPr>
-          <w:b/>
           <w:sz w:val="24"/>
+          <w:szCs w:val="24"/>
+          <w:rFonts w:ascii="Calibri" w:hAnsi="Calibri"/>
+          <w:color w:val="1F3A5F"/>
         </w:rPr>
-        <w:t>Введение</w:t>
+        <w:t>0</w:t>
+      </w:r>
+      <w:r>
+        <w:fldChar w:fldCharType="end"/>
       </w:r>
     </w:p>
     <w:p>
       <w:pPr>
         <w:ind w:left="0"/>
-      </w:pPr>
+        <w:tabs>
+          <w:tab w:val="right" w:leader="dot" w:pos="9072"/>
+        </w:tabs>
+      </w:pPr>
+      <w:hyperlink w:anchor="GRACE_M-BEGIN">
+        <w:r>
+          <w:rPr>
+            <w:sz w:val="24"/>
+            <w:szCs w:val="24"/>
+            <w:rFonts w:ascii="Calibri" w:hAnsi="Calibri"/>
+            <w:b/>
+            <w:color w:val="1F3A5F"/>
+            <w:u w:val="single"/>
+          </w:rPr>
+          <w:t xml:space="preserve">Начало разработки</w:t>
+        </w:r>
+      </w:hyperlink>
+      <w:r>
+        <w:tab/>
+      </w:r>
+      <w:r>
+        <w:fldChar w:fldCharType="begin"/>
+      </w:r>
+      <w:r>
+        <w:instrText xml:space="preserve"> PAGEREF GRACE_M-BEGIN \h </w:instrText>
+      </w:r>
+      <w:r>
+        <w:fldChar w:fldCharType="separate"/>
+      </w:r>
       <w:r>
         <w:rPr>
-          <w:b/>
           <w:sz w:val="24"/>
+          <w:szCs w:val="24"/>
+          <w:rFonts w:ascii="Calibri" w:hAnsi="Calibri"/>
+          <w:color w:val="1F3A5F"/>
         </w:rPr>
-        <w:t>Начало разработки</w:t>
+        <w:t>0</w:t>
+      </w:r>
+      <w:r>
+        <w:fldChar w:fldCharType="end"/>
       </w:r>
     </w:p>
     <w:p>
       <w:pPr>
         <w:ind w:left="0"/>
-      </w:pPr>
+        <w:tabs>
+          <w:tab w:val="right" w:leader="dot" w:pos="9072"/>
+        </w:tabs>
+      </w:pPr>
+      <w:hyperlink w:anchor="GRACE_M-PREFIX">
+        <w:r>
+          <w:rPr>
+            <w:sz w:val="24"/>
+            <w:szCs w:val="24"/>
+            <w:rFonts w:ascii="Calibri" w:hAnsi="Calibri"/>
+            <w:b/>
+            <w:color w:val="1F3A5F"/>
+            <w:u w:val="single"/>
+          </w:rPr>
+          <w:t xml:space="preserve">Префикс и комментарии</w:t>
+        </w:r>
+      </w:hyperlink>
+      <w:r>
+        <w:tab/>
+      </w:r>
+      <w:r>
+        <w:fldChar w:fldCharType="begin"/>
+      </w:r>
+      <w:r>
+        <w:instrText xml:space="preserve"> PAGEREF GRACE_M-PREFIX \h </w:instrText>
+      </w:r>
+      <w:r>
+        <w:fldChar w:fldCharType="separate"/>
+      </w:r>
       <w:r>
         <w:rPr>
-          <w:b/>
           <w:sz w:val="24"/>
+          <w:szCs w:val="24"/>
+          <w:rFonts w:ascii="Calibri" w:hAnsi="Calibri"/>
+          <w:color w:val="1F3A5F"/>
         </w:rPr>
-        <w:t>Префикс и комментарии</w:t>
+        <w:t>0</w:t>
+      </w:r>
+      <w:r>
+        <w:fldChar w:fldCharType="end"/>
       </w:r>
     </w:p>
     <w:p>
       <w:pPr>
         <w:ind w:left="0"/>
-      </w:pPr>
+        <w:tabs>
+          <w:tab w:val="right" w:leader="dot" w:pos="9072"/>
+        </w:tabs>
+      </w:pPr>
+      <w:hyperlink w:anchor="GRACE_M-SEC113">
+        <w:r>
+          <w:rPr>
+            <w:sz w:val="24"/>
+            <w:szCs w:val="24"/>
+            <w:rFonts w:ascii="Calibri" w:hAnsi="Calibri"/>
+            <w:b/>
+            <w:color w:val="1F3A5F"/>
+            <w:u w:val="single"/>
+          </w:rPr>
+          <w:t xml:space="preserve">Оформление</w:t>
+        </w:r>
+      </w:hyperlink>
+      <w:r>
+        <w:tab/>
+      </w:r>
+      <w:r>
+        <w:fldChar w:fldCharType="begin"/>
+      </w:r>
+      <w:r>
+        <w:instrText xml:space="preserve"> PAGEREF GRACE_M-SEC113 \h </w:instrText>
+      </w:r>
+      <w:r>
+        <w:fldChar w:fldCharType="separate"/>
+      </w:r>
       <w:r>
         <w:rPr>
-          <w:b/>
           <w:sz w:val="24"/>
+          <w:szCs w:val="24"/>
+          <w:rFonts w:ascii="Calibri" w:hAnsi="Calibri"/>
+          <w:color w:val="1F3A5F"/>
         </w:rPr>
-        <w:t>Оформление</w:t>
+        <w:t>0</w:t>
+      </w:r>
+      <w:r>
+        <w:fldChar w:fldCharType="end"/>
       </w:r>
     </w:p>
     <w:p>
       <w:pPr>
         <w:ind w:left="0"/>
-      </w:pPr>
+        <w:tabs>
+          <w:tab w:val="right" w:leader="dot" w:pos="9072"/>
+        </w:tabs>
+      </w:pPr>
+      <w:hyperlink w:anchor="GRACE_M-META">
+        <w:r>
+          <w:rPr>
+            <w:sz w:val="24"/>
+            <w:szCs w:val="24"/>
+            <w:rFonts w:ascii="Calibri" w:hAnsi="Calibri"/>
+            <w:b/>
+            <w:color w:val="1F3A5F"/>
+            <w:u w:val="single"/>
+          </w:rPr>
+          <w:t xml:space="preserve">Метаданные</w:t>
+        </w:r>
+      </w:hyperlink>
+      <w:r>
+        <w:tab/>
+      </w:r>
+      <w:r>
+        <w:fldChar w:fldCharType="begin"/>
+      </w:r>
+      <w:r>
+        <w:instrText xml:space="preserve"> PAGEREF GRACE_M-META \h </w:instrText>
+      </w:r>
+      <w:r>
+        <w:fldChar w:fldCharType="separate"/>
+      </w:r>
       <w:r>
         <w:rPr>
-          <w:b/>
           <w:sz w:val="24"/>
+          <w:szCs w:val="24"/>
+          <w:rFonts w:ascii="Calibri" w:hAnsi="Calibri"/>
+          <w:color w:val="1F3A5F"/>
         </w:rPr>
-        <w:t>Метаданные</w:t>
+        <w:t>0</w:t>
+      </w:r>
+      <w:r>
+        <w:fldChar w:fldCharType="end"/>
       </w:r>
     </w:p>
     <w:p>
       <w:pPr>
         <w:ind w:left="425"/>
-      </w:pPr>
+        <w:tabs>
+          <w:tab w:val="right" w:leader="dot" w:pos="9072"/>
+        </w:tabs>
+      </w:pPr>
+      <w:hyperlink w:anchor="GRACE_M-COMMON">
+        <w:r>
+          <w:rPr>
+            <w:sz w:val="22"/>
+            <w:szCs w:val="22"/>
+            <w:rFonts w:ascii="Calibri" w:hAnsi="Calibri"/>
+            <w:color w:val="1F3A5F"/>
+            <w:u w:val="single"/>
+          </w:rPr>
+          <w:t xml:space="preserve">Общие модули</w:t>
+        </w:r>
+      </w:hyperlink>
+      <w:r>
+        <w:tab/>
+      </w:r>
+      <w:r>
+        <w:fldChar w:fldCharType="begin"/>
+      </w:r>
+      <w:r>
+        <w:instrText xml:space="preserve"> PAGEREF GRACE_M-COMMON \h </w:instrText>
+      </w:r>
+      <w:r>
+        <w:fldChar w:fldCharType="separate"/>
+      </w:r>
       <w:r>
         <w:rPr>
           <w:sz w:val="22"/>
+          <w:szCs w:val="22"/>
+          <w:rFonts w:ascii="Calibri" w:hAnsi="Calibri"/>
+          <w:color w:val="1F3A5F"/>
         </w:rPr>
-        <w:t>Общие модули</w:t>
+        <w:t>0</w:t>
+      </w:r>
+      <w:r>
+        <w:fldChar w:fldCharType="end"/>
       </w:r>
     </w:p>
     <w:p>
       <w:pPr>
         <w:ind w:left="425"/>
-      </w:pPr>
+        <w:tabs>
+          <w:tab w:val="right" w:leader="dot" w:pos="9072"/>
+        </w:tabs>
+      </w:pPr>
+      <w:hyperlink w:anchor="GRACE_M-SUBSYS">
+        <w:r>
+          <w:rPr>
+            <w:sz w:val="22"/>
+            <w:szCs w:val="22"/>
+            <w:rFonts w:ascii="Calibri" w:hAnsi="Calibri"/>
+            <w:color w:val="1F3A5F"/>
+            <w:u w:val="single"/>
+          </w:rPr>
+          <w:t xml:space="preserve">Подсистемы</w:t>
+        </w:r>
+      </w:hyperlink>
+      <w:r>
+        <w:tab/>
+      </w:r>
+      <w:r>
+        <w:fldChar w:fldCharType="begin"/>
+      </w:r>
+      <w:r>
+        <w:instrText xml:space="preserve"> PAGEREF GRACE_M-SUBSYS \h </w:instrText>
+      </w:r>
+      <w:r>
+        <w:fldChar w:fldCharType="separate"/>
+      </w:r>
       <w:r>
         <w:rPr>
           <w:sz w:val="22"/>
+          <w:szCs w:val="22"/>
+          <w:rFonts w:ascii="Calibri" w:hAnsi="Calibri"/>
+          <w:color w:val="1F3A5F"/>
         </w:rPr>
-        <w:t>Подсистемы</w:t>
+        <w:t>0</w:t>
+      </w:r>
+      <w:r>
+        <w:fldChar w:fldCharType="end"/>
       </w:r>
     </w:p>
     <w:p>
       <w:pPr>
         <w:ind w:left="425"/>
-      </w:pPr>
+        <w:tabs>
+          <w:tab w:val="right" w:leader="dot" w:pos="9072"/>
+        </w:tabs>
+      </w:pPr>
+      <w:hyperlink w:anchor="GRACE_M-ROLES">
+        <w:r>
+          <w:rPr>
+            <w:sz w:val="22"/>
+            <w:szCs w:val="22"/>
+            <w:rFonts w:ascii="Calibri" w:hAnsi="Calibri"/>
+            <w:color w:val="1F3A5F"/>
+            <w:u w:val="single"/>
+          </w:rPr>
+          <w:t xml:space="preserve">Роли</w:t>
+        </w:r>
+      </w:hyperlink>
+      <w:r>
+        <w:tab/>
+      </w:r>
+      <w:r>
+        <w:fldChar w:fldCharType="begin"/>
+      </w:r>
+      <w:r>
+        <w:instrText xml:space="preserve"> PAGEREF GRACE_M-ROLES \h </w:instrText>
+      </w:r>
+      <w:r>
+        <w:fldChar w:fldCharType="separate"/>
+      </w:r>
       <w:r>
         <w:rPr>
           <w:sz w:val="22"/>
+          <w:szCs w:val="22"/>
+          <w:rFonts w:ascii="Calibri" w:hAnsi="Calibri"/>
+          <w:color w:val="1F3A5F"/>
         </w:rPr>
-        <w:t>Роли</w:t>
+        <w:t>0</w:t>
+      </w:r>
+      <w:r>
+        <w:fldChar w:fldCharType="end"/>
       </w:r>
     </w:p>
     <w:p>
       <w:pPr>
         <w:ind w:left="425"/>
-      </w:pPr>
+        <w:tabs>
+          <w:tab w:val="right" w:leader="dot" w:pos="9072"/>
+        </w:tabs>
+      </w:pPr>
+      <w:hyperlink w:anchor="GRACE_M-EVTSUB">
+        <w:r>
+          <w:rPr>
+            <w:sz w:val="22"/>
+            <w:szCs w:val="22"/>
+            <w:rFonts w:ascii="Calibri" w:hAnsi="Calibri"/>
+            <w:color w:val="1F3A5F"/>
+            <w:u w:val="single"/>
+          </w:rPr>
+          <w:t xml:space="preserve">Подписки на события</w:t>
+        </w:r>
+      </w:hyperlink>
+      <w:r>
+        <w:tab/>
+      </w:r>
+      <w:r>
+        <w:fldChar w:fldCharType="begin"/>
+      </w:r>
+      <w:r>
+        <w:instrText xml:space="preserve"> PAGEREF GRACE_M-EVTSUB \h </w:instrText>
+      </w:r>
+      <w:r>
+        <w:fldChar w:fldCharType="separate"/>
+      </w:r>
       <w:r>
         <w:rPr>
           <w:sz w:val="22"/>
+          <w:szCs w:val="22"/>
+          <w:rFonts w:ascii="Calibri" w:hAnsi="Calibri"/>
+          <w:color w:val="1F3A5F"/>
         </w:rPr>
-        <w:t>Подписки на события</w:t>
+        <w:t>0</w:t>
+      </w:r>
+      <w:r>
+        <w:fldChar w:fldCharType="end"/>
       </w:r>
     </w:p>
     <w:p>
       <w:pPr>
         <w:ind w:left="425"/>
-      </w:pPr>
+        <w:tabs>
+          <w:tab w:val="right" w:leader="dot" w:pos="9072"/>
+        </w:tabs>
+      </w:pPr>
+      <w:hyperlink w:anchor="GRACE_M-SCHED">
+        <w:r>
+          <w:rPr>
+            <w:sz w:val="22"/>
+            <w:szCs w:val="22"/>
+            <w:rFonts w:ascii="Calibri" w:hAnsi="Calibri"/>
+            <w:color w:val="1F3A5F"/>
+            <w:u w:val="single"/>
+          </w:rPr>
+          <w:t xml:space="preserve">Регламентные задания</w:t>
+        </w:r>
+      </w:hyperlink>
+      <w:r>
+        <w:tab/>
+      </w:r>
+      <w:r>
+        <w:fldChar w:fldCharType="begin"/>
+      </w:r>
+      <w:r>
+        <w:instrText xml:space="preserve"> PAGEREF GRACE_M-SCHED \h </w:instrText>
+      </w:r>
+      <w:r>
+        <w:fldChar w:fldCharType="separate"/>
+      </w:r>
       <w:r>
         <w:rPr>
           <w:sz w:val="22"/>
+          <w:szCs w:val="22"/>
+          <w:rFonts w:ascii="Calibri" w:hAnsi="Calibri"/>
+          <w:color w:val="1F3A5F"/>
         </w:rPr>
-        <w:t>Регламентные задания</w:t>
+        <w:t>0</w:t>
+      </w:r>
+      <w:r>
+        <w:fldChar w:fldCharType="end"/>
       </w:r>
     </w:p>
     <w:p>
       <w:pPr>
         <w:ind w:left="425"/>
-      </w:pPr>
+        <w:tabs>
+          <w:tab w:val="right" w:leader="dot" w:pos="9072"/>
+        </w:tabs>
+      </w:pPr>
+      <w:hyperlink w:anchor="GRACE_M-CATALOG">
+        <w:r>
+          <w:rPr>
+            <w:sz w:val="22"/>
+            <w:szCs w:val="22"/>
+            <w:rFonts w:ascii="Calibri" w:hAnsi="Calibri"/>
+            <w:color w:val="1F3A5F"/>
+            <w:u w:val="single"/>
+          </w:rPr>
+          <w:t xml:space="preserve">Справочники</w:t>
+        </w:r>
+      </w:hyperlink>
+      <w:r>
+        <w:tab/>
+      </w:r>
+      <w:r>
+        <w:fldChar w:fldCharType="begin"/>
+      </w:r>
+      <w:r>
+        <w:instrText xml:space="preserve"> PAGEREF GRACE_M-CATALOG \h </w:instrText>
+      </w:r>
+      <w:r>
+        <w:fldChar w:fldCharType="separate"/>
+      </w:r>
       <w:r>
         <w:rPr>
           <w:sz w:val="22"/>
+          <w:szCs w:val="22"/>
+          <w:rFonts w:ascii="Calibri" w:hAnsi="Calibri"/>
+          <w:color w:val="1F3A5F"/>
         </w:rPr>
-        <w:t>Справочники</w:t>
+        <w:t>0</w:t>
+      </w:r>
+      <w:r>
+        <w:fldChar w:fldCharType="end"/>
       </w:r>
     </w:p>
     <w:p>
       <w:pPr>
         <w:ind w:left="425"/>
-      </w:pPr>
+        <w:tabs>
+          <w:tab w:val="right" w:leader="dot" w:pos="9072"/>
+        </w:tabs>
+      </w:pPr>
+      <w:hyperlink w:anchor="GRACE_M-DOCS">
+        <w:r>
+          <w:rPr>
+            <w:sz w:val="22"/>
+            <w:szCs w:val="22"/>
+            <w:rFonts w:ascii="Calibri" w:hAnsi="Calibri"/>
+            <w:color w:val="1F3A5F"/>
+            <w:u w:val="single"/>
+          </w:rPr>
+          <w:t xml:space="preserve">Документы</w:t>
+        </w:r>
+      </w:hyperlink>
+      <w:r>
+        <w:tab/>
+      </w:r>
+      <w:r>
+        <w:fldChar w:fldCharType="begin"/>
+      </w:r>
+      <w:r>
+        <w:instrText xml:space="preserve"> PAGEREF GRACE_M-DOCS \h </w:instrText>
+      </w:r>
+      <w:r>
+        <w:fldChar w:fldCharType="separate"/>
+      </w:r>
       <w:r>
         <w:rPr>
           <w:sz w:val="22"/>
+          <w:szCs w:val="22"/>
+          <w:rFonts w:ascii="Calibri" w:hAnsi="Calibri"/>
+          <w:color w:val="1F3A5F"/>
         </w:rPr>
-        <w:t>Документы</w:t>
+        <w:t>0</w:t>
+      </w:r>
+      <w:r>
+        <w:fldChar w:fldCharType="end"/>
       </w:r>
     </w:p>
     <w:p>
       <w:pPr>
         <w:ind w:left="425"/>
-      </w:pPr>
+        <w:tabs>
+          <w:tab w:val="right" w:leader="dot" w:pos="9072"/>
+        </w:tabs>
+      </w:pPr>
+      <w:hyperlink w:anchor="GRACE_M-REPORTS">
+        <w:r>
+          <w:rPr>
+            <w:sz w:val="22"/>
+            <w:szCs w:val="22"/>
+            <w:rFonts w:ascii="Calibri" w:hAnsi="Calibri"/>
+            <w:color w:val="1F3A5F"/>
+            <w:u w:val="single"/>
+          </w:rPr>
+          <w:t xml:space="preserve">Отчеты</w:t>
+        </w:r>
+      </w:hyperlink>
+      <w:r>
+        <w:tab/>
+      </w:r>
+      <w:r>
+        <w:fldChar w:fldCharType="begin"/>
+      </w:r>
+      <w:r>
+        <w:instrText xml:space="preserve"> PAGEREF GRACE_M-REPORTS \h </w:instrText>
+      </w:r>
+      <w:r>
+        <w:fldChar w:fldCharType="separate"/>
+      </w:r>
       <w:r>
         <w:rPr>
           <w:sz w:val="22"/>
+          <w:szCs w:val="22"/>
+          <w:rFonts w:ascii="Calibri" w:hAnsi="Calibri"/>
+          <w:color w:val="1F3A5F"/>
         </w:rPr>
-        <w:t>Отчеты</w:t>
+        <w:t>0</w:t>
+      </w:r>
+      <w:r>
+        <w:fldChar w:fldCharType="end"/>
       </w:r>
     </w:p>
     <w:p>
       <w:pPr>
         <w:ind w:left="425"/>
-      </w:pPr>
+        <w:tabs>
+          <w:tab w:val="right" w:leader="dot" w:pos="9072"/>
+        </w:tabs>
+      </w:pPr>
+      <w:hyperlink w:anchor="GRACE_M-INFREG">
+        <w:r>
+          <w:rPr>
+            <w:sz w:val="22"/>
+            <w:szCs w:val="22"/>
+            <w:rFonts w:ascii="Calibri" w:hAnsi="Calibri"/>
+            <w:color w:val="1F3A5F"/>
+            <w:u w:val="single"/>
+          </w:rPr>
+          <w:t xml:space="preserve">Регистры сведений</w:t>
+        </w:r>
+      </w:hyperlink>
+      <w:r>
+        <w:tab/>
+      </w:r>
+      <w:r>
+        <w:fldChar w:fldCharType="begin"/>
+      </w:r>
+      <w:r>
+        <w:instrText xml:space="preserve"> PAGEREF GRACE_M-INFREG \h </w:instrText>
+      </w:r>
+      <w:r>
+        <w:fldChar w:fldCharType="separate"/>
+      </w:r>
       <w:r>
         <w:rPr>
           <w:sz w:val="22"/>
+          <w:szCs w:val="22"/>
+          <w:rFonts w:ascii="Calibri" w:hAnsi="Calibri"/>
+          <w:color w:val="1F3A5F"/>
         </w:rPr>
-        <w:t>Регистры сведений</w:t>
+        <w:t>0</w:t>
+      </w:r>
+      <w:r>
+        <w:fldChar w:fldCharType="end"/>
       </w:r>
     </w:p>
     <w:p>
       <w:pPr>
         <w:ind w:left="425"/>
-      </w:pPr>
+        <w:tabs>
+          <w:tab w:val="right" w:leader="dot" w:pos="9072"/>
+        </w:tabs>
+      </w:pPr>
+      <w:hyperlink w:anchor="GRACE_M-ACCREG">
+        <w:r>
+          <w:rPr>
+            <w:sz w:val="22"/>
+            <w:szCs w:val="22"/>
+            <w:rFonts w:ascii="Calibri" w:hAnsi="Calibri"/>
+            <w:color w:val="1F3A5F"/>
+            <w:u w:val="single"/>
+          </w:rPr>
+          <w:t xml:space="preserve">Регистры накопления</w:t>
+        </w:r>
+      </w:hyperlink>
+      <w:r>
+        <w:tab/>
+      </w:r>
+      <w:r>
+        <w:fldChar w:fldCharType="begin"/>
+      </w:r>
+      <w:r>
+        <w:instrText xml:space="preserve"> PAGEREF GRACE_M-ACCREG \h </w:instrText>
+      </w:r>
+      <w:r>
+        <w:fldChar w:fldCharType="separate"/>
+      </w:r>
       <w:r>
         <w:rPr>
           <w:sz w:val="22"/>
+          <w:szCs w:val="22"/>
+          <w:rFonts w:ascii="Calibri" w:hAnsi="Calibri"/>
+          <w:color w:val="1F3A5F"/>
         </w:rPr>
-        <w:t>Регистры накопления</w:t>
+        <w:t>0</w:t>
+      </w:r>
+      <w:r>
+        <w:fldChar w:fldCharType="end"/>
       </w:r>
     </w:p>
     <w:p>
       <w:pPr>
         <w:ind w:left="0"/>
-      </w:pPr>
+        <w:tabs>
+          <w:tab w:val="right" w:leader="dot" w:pos="9072"/>
+        </w:tabs>
+      </w:pPr>
+      <w:hyperlink w:anchor="GRACE_M-QUERY">
+        <w:r>
+          <w:rPr>
+            <w:sz w:val="24"/>
+            <w:szCs w:val="24"/>
+            <w:rFonts w:ascii="Calibri" w:hAnsi="Calibri"/>
+            <w:b/>
+            <w:color w:val="1F3A5F"/>
+            <w:u w:val="single"/>
+          </w:rPr>
+          <w:t xml:space="preserve">Запросы</w:t>
+        </w:r>
+      </w:hyperlink>
+      <w:r>
+        <w:tab/>
+      </w:r>
+      <w:r>
+        <w:fldChar w:fldCharType="begin"/>
+      </w:r>
+      <w:r>
+        <w:instrText xml:space="preserve"> PAGEREF GRACE_M-QUERY \h </w:instrText>
+      </w:r>
+      <w:r>
+        <w:fldChar w:fldCharType="separate"/>
+      </w:r>
       <w:r>
         <w:rPr>
-          <w:b/>
           <w:sz w:val="24"/>
+          <w:szCs w:val="24"/>
+          <w:rFonts w:ascii="Calibri" w:hAnsi="Calibri"/>
+          <w:color w:val="1F3A5F"/>
         </w:rPr>
-        <w:t>Запросы</w:t>
+        <w:t>0</w:t>
+      </w:r>
+      <w:r>
+        <w:fldChar w:fldCharType="end"/>
       </w:r>
     </w:p>
     <w:p>
       <w:pPr>
         <w:ind w:left="0"/>
-      </w:pPr>
+        <w:tabs>
+          <w:tab w:val="right" w:leader="dot" w:pos="9072"/>
+        </w:tabs>
+      </w:pPr>
+      <w:hyperlink w:anchor="GRACE_M-FORMS">
+        <w:r>
+          <w:rPr>
+            <w:sz w:val="24"/>
+            <w:szCs w:val="24"/>
+            <w:rFonts w:ascii="Calibri" w:hAnsi="Calibri"/>
+            <w:b/>
+            <w:color w:val="1F3A5F"/>
+            <w:u w:val="single"/>
+          </w:rPr>
+          <w:t xml:space="preserve">Управляемые формы</w:t>
+        </w:r>
+      </w:hyperlink>
+      <w:r>
+        <w:tab/>
+      </w:r>
+      <w:r>
+        <w:fldChar w:fldCharType="begin"/>
+      </w:r>
+      <w:r>
+        <w:instrText xml:space="preserve"> PAGEREF GRACE_M-FORMS \h </w:instrText>
+      </w:r>
+      <w:r>
+        <w:fldChar w:fldCharType="separate"/>
+      </w:r>
       <w:r>
         <w:rPr>
-          <w:b/>
           <w:sz w:val="24"/>
+          <w:szCs w:val="24"/>
+          <w:rFonts w:ascii="Calibri" w:hAnsi="Calibri"/>
+          <w:color w:val="1F3A5F"/>
         </w:rPr>
-        <w:t>Управляемые формы</w:t>
+        <w:t>0</w:t>
+      </w:r>
+      <w:r>
+        <w:fldChar w:fldCharType="end"/>
       </w:r>
     </w:p>
     <w:p>
       <w:pPr>
         <w:ind w:left="0"/>
-      </w:pPr>
+        <w:tabs>
+          <w:tab w:val="right" w:leader="dot" w:pos="9072"/>
+        </w:tabs>
+      </w:pPr>
+      <w:hyperlink w:anchor="GRACE_M-BLOCK">
+        <w:r>
+          <w:rPr>
+            <w:sz w:val="24"/>
+            <w:szCs w:val="24"/>
+            <w:rFonts w:ascii="Calibri" w:hAnsi="Calibri"/>
+            <w:b/>
+            <w:color w:val="1F3A5F"/>
+            <w:u w:val="single"/>
+          </w:rPr>
+          <w:t xml:space="preserve">Блокировка форм</w:t>
+        </w:r>
+      </w:hyperlink>
+      <w:r>
+        <w:tab/>
+      </w:r>
+      <w:r>
+        <w:fldChar w:fldCharType="begin"/>
+      </w:r>
+      <w:r>
+        <w:instrText xml:space="preserve"> PAGEREF GRACE_M-BLOCK \h </w:instrText>
+      </w:r>
+      <w:r>
+        <w:fldChar w:fldCharType="separate"/>
+      </w:r>
       <w:r>
         <w:rPr>
-          <w:b/>
           <w:sz w:val="24"/>
+          <w:szCs w:val="24"/>
+          <w:rFonts w:ascii="Calibri" w:hAnsi="Calibri"/>
+          <w:color w:val="1F3A5F"/>
         </w:rPr>
-        <w:t>Блокировка форм</w:t>
+        <w:t>0</w:t>
+      </w:r>
+      <w:r>
+        <w:fldChar w:fldCharType="end"/>
       </w:r>
     </w:p>
     <w:p>
       <w:pPr>
         <w:ind w:left="0"/>
-      </w:pPr>
+        <w:tabs>
+          <w:tab w:val="right" w:leader="dot" w:pos="9072"/>
+        </w:tabs>
+      </w:pPr>
+      <w:hyperlink w:anchor="GRACE_M-PRINT">
+        <w:r>
+          <w:rPr>
+            <w:sz w:val="24"/>
+            <w:szCs w:val="24"/>
+            <w:rFonts w:ascii="Calibri" w:hAnsi="Calibri"/>
+            <w:b/>
+            <w:color w:val="1F3A5F"/>
+            <w:u w:val="single"/>
+          </w:rPr>
+          <w:t xml:space="preserve">Печатные формы</w:t>
+        </w:r>
+      </w:hyperlink>
+      <w:r>
+        <w:tab/>
+      </w:r>
+      <w:r>
+        <w:fldChar w:fldCharType="begin"/>
+      </w:r>
+      <w:r>
+        <w:instrText xml:space="preserve"> PAGEREF GRACE_M-PRINT \h </w:instrText>
+      </w:r>
+      <w:r>
+        <w:fldChar w:fldCharType="separate"/>
+      </w:r>
       <w:r>
         <w:rPr>
-          <w:b/>
           <w:sz w:val="24"/>
+          <w:szCs w:val="24"/>
+          <w:rFonts w:ascii="Calibri" w:hAnsi="Calibri"/>
+          <w:color w:val="1F3A5F"/>
         </w:rPr>
-        <w:t>Печатные формы</w:t>
+        <w:t>0</w:t>
+      </w:r>
+      <w:r>
+        <w:fldChar w:fldCharType="end"/>
       </w:r>
     </w:p>
     <w:p>
       <w:pPr>
         <w:ind w:left="0"/>
-      </w:pPr>
+        <w:tabs>
+          <w:tab w:val="right" w:leader="dot" w:pos="9072"/>
+        </w:tabs>
+      </w:pPr>
+      <w:hyperlink w:anchor="GRACE_M-INPUT">
+        <w:r>
+          <w:rPr>
+            <w:sz w:val="24"/>
+            <w:szCs w:val="24"/>
+            <w:rFonts w:ascii="Calibri" w:hAnsi="Calibri"/>
+            <w:b/>
+            <w:color w:val="1F3A5F"/>
+            <w:u w:val="single"/>
+          </w:rPr>
+          <w:t xml:space="preserve">Ввод на основании</w:t>
+        </w:r>
+      </w:hyperlink>
+      <w:r>
+        <w:tab/>
+      </w:r>
+      <w:r>
+        <w:fldChar w:fldCharType="begin"/>
+      </w:r>
+      <w:r>
+        <w:instrText xml:space="preserve"> PAGEREF GRACE_M-INPUT \h </w:instrText>
+      </w:r>
+      <w:r>
+        <w:fldChar w:fldCharType="separate"/>
+      </w:r>
       <w:r>
         <w:rPr>
-          <w:b/>
           <w:sz w:val="24"/>
+          <w:szCs w:val="24"/>
+          <w:rFonts w:ascii="Calibri" w:hAnsi="Calibri"/>
+          <w:color w:val="1F3A5F"/>
         </w:rPr>
-        <w:t>Ввод на основании</w:t>
+        <w:t>0</w:t>
+      </w:r>
+      <w:r>
+        <w:fldChar w:fldCharType="end"/>
       </w:r>
     </w:p>
     <w:p>
       <w:pPr>
         <w:ind w:left="0"/>
-      </w:pPr>
+        <w:tabs>
+          <w:tab w:val="right" w:leader="dot" w:pos="9072"/>
+        </w:tabs>
+      </w:pPr>
+      <w:hyperlink w:anchor="GRACE_M-EXT">
+        <w:r>
+          <w:rPr>
+            <w:sz w:val="24"/>
+            <w:szCs w:val="24"/>
+            <w:rFonts w:ascii="Calibri" w:hAnsi="Calibri"/>
+            <w:b/>
+            <w:color w:val="1F3A5F"/>
+            <w:u w:val="single"/>
+          </w:rPr>
+          <w:t xml:space="preserve">Расширения</w:t>
+        </w:r>
+      </w:hyperlink>
+      <w:r>
+        <w:tab/>
+      </w:r>
+      <w:r>
+        <w:fldChar w:fldCharType="begin"/>
+      </w:r>
+      <w:r>
+        <w:instrText xml:space="preserve"> PAGEREF GRACE_M-EXT \h </w:instrText>
+      </w:r>
+      <w:r>
+        <w:fldChar w:fldCharType="separate"/>
+      </w:r>
       <w:r>
         <w:rPr>
-          <w:b/>
           <w:sz w:val="24"/>
+          <w:szCs w:val="24"/>
+          <w:rFonts w:ascii="Calibri" w:hAnsi="Calibri"/>
+          <w:color w:val="1F3A5F"/>
         </w:rPr>
-        <w:t>Расширения</w:t>
+        <w:t>0</w:t>
+      </w:r>
+      <w:r>
+        <w:fldChar w:fldCharType="end"/>
       </w:r>
     </w:p>
     <w:p>
       <w:pPr>
         <w:ind w:left="0"/>
-      </w:pPr>
+        <w:tabs>
+          <w:tab w:val="right" w:leader="dot" w:pos="9072"/>
+        </w:tabs>
+      </w:pPr>
+      <w:hyperlink w:anchor="GRACE_M-SEC131">
+        <w:r>
+          <w:rPr>
+            <w:sz w:val="24"/>
+            <w:szCs w:val="24"/>
+            <w:rFonts w:ascii="Calibri" w:hAnsi="Calibri"/>
+            <w:b/>
+            <w:color w:val="1F3A5F"/>
+            <w:u w:val="single"/>
+          </w:rPr>
+          <w:t xml:space="preserve">Глоссарий</w:t>
+        </w:r>
+      </w:hyperlink>
+      <w:r>
+        <w:tab/>
+      </w:r>
+      <w:r>
+        <w:fldChar w:fldCharType="begin"/>
+      </w:r>
+      <w:r>
+        <w:instrText xml:space="preserve"> PAGEREF GRACE_M-SEC131 \h </w:instrText>
+      </w:r>
+      <w:r>
+        <w:fldChar w:fldCharType="separate"/>
+      </w:r>
       <w:r>
         <w:rPr>
-          <w:b/>
           <w:sz w:val="24"/>
+          <w:szCs w:val="24"/>
+          <w:rFonts w:ascii="Calibri" w:hAnsi="Calibri"/>
+          <w:color w:val="1F3A5F"/>
         </w:rPr>
-        <w:t>Глоссарий</w:t>
+        <w:t>0</w:t>
+      </w:r>
+      <w:r>
+        <w:fldChar w:fldCharType="end"/>
       </w:r>
     </w:p>
     <w:p>
       <w:pPr>
         <w:ind w:left="0"/>
-      </w:pPr>
+        <w:tabs>
+          <w:tab w:val="right" w:leader="dot" w:pos="9072"/>
+        </w:tabs>
+      </w:pPr>
+      <w:hyperlink w:anchor="GRACE_M-VC">
+        <w:r>
+          <w:rPr>
+            <w:sz w:val="24"/>
+            <w:szCs w:val="24"/>
+            <w:rFonts w:ascii="Calibri" w:hAnsi="Calibri"/>
+            <w:b/>
+            <w:color w:val="1F3A5F"/>
+            <w:u w:val="single"/>
+          </w:rPr>
+          <w:t xml:space="preserve">Система управления версиями</w:t>
+        </w:r>
+      </w:hyperlink>
+      <w:r>
+        <w:tab/>
+      </w:r>
+      <w:r>
+        <w:fldChar w:fldCharType="begin"/>
+      </w:r>
+      <w:r>
+        <w:instrText xml:space="preserve"> PAGEREF GRACE_M-VC \h </w:instrText>
+      </w:r>
+      <w:r>
+        <w:fldChar w:fldCharType="separate"/>
+      </w:r>
       <w:r>
         <w:rPr>
-          <w:b/>
           <w:sz w:val="24"/>
+          <w:szCs w:val="24"/>
+          <w:rFonts w:ascii="Calibri" w:hAnsi="Calibri"/>
+          <w:color w:val="1F3A5F"/>
         </w:rPr>
-        <w:t>Система управления версиями</w:t>
+        <w:t>0</w:t>
+      </w:r>
+      <w:r>
+        <w:fldChar w:fldCharType="end"/>
       </w:r>
     </w:p>
     <w:p>
       <w:pPr>
         <w:ind w:left="425"/>
-      </w:pPr>
+        <w:tabs>
+          <w:tab w:val="right" w:leader="dot" w:pos="9072"/>
+        </w:tabs>
+      </w:pPr>
+      <w:hyperlink w:anchor="GRACE_M-VC-2">
+        <w:r>
+          <w:rPr>
+            <w:sz w:val="22"/>
+            <w:szCs w:val="22"/>
+            <w:rFonts w:ascii="Calibri" w:hAnsi="Calibri"/>
+            <w:color w:val="1F3A5F"/>
+            <w:u w:val="single"/>
+          </w:rPr>
+          <w:t xml:space="preserve">Система управления версиями</w:t>
+        </w:r>
+      </w:hyperlink>
+      <w:r>
+        <w:tab/>
+      </w:r>
+      <w:r>
+        <w:fldChar w:fldCharType="begin"/>
+      </w:r>
+      <w:r>
+        <w:instrText xml:space="preserve"> PAGEREF GRACE_M-VC-2 \h </w:instrText>
+      </w:r>
+      <w:r>
+        <w:fldChar w:fldCharType="separate"/>
+      </w:r>
       <w:r>
         <w:rPr>
           <w:sz w:val="22"/>
+          <w:szCs w:val="22"/>
+          <w:rFonts w:ascii="Calibri" w:hAnsi="Calibri"/>
+          <w:color w:val="1F3A5F"/>
         </w:rPr>
-        <w:t>Система управления версиями</w:t>
+        <w:t>0</w:t>
+      </w:r>
+      <w:r>
+        <w:fldChar w:fldCharType="end"/>
       </w:r>
     </w:p>
     <w:p>
       <w:pPr>
         <w:ind w:left="425"/>
-      </w:pPr>
+        <w:tabs>
+          <w:tab w:val="right" w:leader="dot" w:pos="9072"/>
+        </w:tabs>
+      </w:pPr>
+      <w:hyperlink w:anchor="GRACE_M-1CSTO">
+        <w:r>
+          <w:rPr>
+            <w:sz w:val="22"/>
+            <w:szCs w:val="22"/>
+            <w:rFonts w:ascii="Calibri" w:hAnsi="Calibri"/>
+            <w:color w:val="1F3A5F"/>
+            <w:u w:val="single"/>
+          </w:rPr>
+          <w:t xml:space="preserve">1c-storage</w:t>
+        </w:r>
+      </w:hyperlink>
+      <w:r>
+        <w:tab/>
+      </w:r>
+      <w:r>
+        <w:fldChar w:fldCharType="begin"/>
+      </w:r>
+      <w:r>
+        <w:instrText xml:space="preserve"> PAGEREF GRACE_M-1CSTO \h </w:instrText>
+      </w:r>
+      <w:r>
+        <w:fldChar w:fldCharType="separate"/>
+      </w:r>
       <w:r>
         <w:rPr>
           <w:sz w:val="22"/>
+          <w:szCs w:val="22"/>
+          <w:rFonts w:ascii="Calibri" w:hAnsi="Calibri"/>
+          <w:color w:val="1F3A5F"/>
         </w:rPr>
-        <w:t>1c-storage</w:t>
+        <w:t>0</w:t>
+      </w:r>
+      <w:r>
+        <w:fldChar w:fldCharType="end"/>
       </w:r>
     </w:p>
     <w:p>
       <w:pPr>
         <w:ind w:left="850"/>
-      </w:pPr>
+        <w:tabs>
+          <w:tab w:val="right" w:leader="dot" w:pos="9072"/>
+        </w:tabs>
+      </w:pPr>
+      <w:hyperlink w:anchor="GRACE_M-1CSTOR">
+        <w:r>
+          <w:rPr>
+            <w:sz w:val="22"/>
+            <w:szCs w:val="22"/>
+            <w:rFonts w:ascii="Calibri" w:hAnsi="Calibri"/>
+            <w:color w:val="1F3A5F"/>
+            <w:u w:val="single"/>
+          </w:rPr>
+          <w:t xml:space="preserve">Хранилище 1С</w:t>
+        </w:r>
+      </w:hyperlink>
+      <w:r>
+        <w:tab/>
+      </w:r>
+      <w:r>
+        <w:fldChar w:fldCharType="begin"/>
+      </w:r>
+      <w:r>
+        <w:instrText xml:space="preserve"> PAGEREF GRACE_M-1CSTOR \h </w:instrText>
+      </w:r>
+      <w:r>
+        <w:fldChar w:fldCharType="separate"/>
+      </w:r>
       <w:r>
         <w:rPr>
           <w:sz w:val="22"/>
+          <w:szCs w:val="22"/>
+          <w:rFonts w:ascii="Calibri" w:hAnsi="Calibri"/>
+          <w:color w:val="1F3A5F"/>
         </w:rPr>
-        <w:t>Хранилище 1С</w:t>
+        <w:t>0</w:t>
+      </w:r>
+      <w:r>
+        <w:fldChar w:fldCharType="end"/>
       </w:r>
     </w:p>
     <w:p>
       <w:pPr>
         <w:ind w:left="425"/>
-      </w:pPr>
+        <w:tabs>
+          <w:tab w:val="right" w:leader="dot" w:pos="9072"/>
+        </w:tabs>
+      </w:pPr>
+      <w:hyperlink w:anchor="GRACE_M-GIT">
+        <w:r>
+          <w:rPr>
+            <w:sz w:val="22"/>
+            <w:szCs w:val="22"/>
+            <w:rFonts w:ascii="Calibri" w:hAnsi="Calibri"/>
+            <w:color w:val="1F3A5F"/>
+            <w:u w:val="single"/>
+          </w:rPr>
+          <w:t xml:space="preserve">git</w:t>
+        </w:r>
+      </w:hyperlink>
+      <w:r>
+        <w:tab/>
+      </w:r>
+      <w:r>
+        <w:fldChar w:fldCharType="begin"/>
+      </w:r>
+      <w:r>
+        <w:instrText xml:space="preserve"> PAGEREF GRACE_M-GIT \h </w:instrText>
+      </w:r>
+      <w:r>
+        <w:fldChar w:fldCharType="separate"/>
+      </w:r>
       <w:r>
         <w:rPr>
           <w:sz w:val="22"/>
+          <w:szCs w:val="22"/>
+          <w:rFonts w:ascii="Calibri" w:hAnsi="Calibri"/>
+          <w:color w:val="1F3A5F"/>
         </w:rPr>
-        <w:t>git</w:t>
+        <w:t>0</w:t>
+      </w:r>
+      <w:r>
+        <w:fldChar w:fldCharType="end"/>
       </w:r>
     </w:p>
     <w:p>
       <w:pPr>
         <w:ind w:left="850"/>
-      </w:pPr>
+        <w:tabs>
+          <w:tab w:val="right" w:leader="dot" w:pos="9072"/>
+        </w:tabs>
+      </w:pPr>
+      <w:hyperlink w:anchor="GRACE_M-GIT37">
+        <w:r>
+          <w:rPr>
+            <w:sz w:val="22"/>
+            <w:szCs w:val="22"/>
+            <w:rFonts w:ascii="Calibri" w:hAnsi="Calibri"/>
+            <w:color w:val="1F3A5F"/>
+            <w:u w:val="single"/>
+          </w:rPr>
+          <w:t xml:space="preserve">Git</w:t>
+        </w:r>
+      </w:hyperlink>
+      <w:r>
+        <w:tab/>
+      </w:r>
+      <w:r>
+        <w:fldChar w:fldCharType="begin"/>
+      </w:r>
+      <w:r>
+        <w:instrText xml:space="preserve"> PAGEREF GRACE_M-GIT37 \h </w:instrText>
+      </w:r>
+      <w:r>
+        <w:fldChar w:fldCharType="separate"/>
+      </w:r>
       <w:r>
         <w:rPr>
           <w:sz w:val="22"/>
+          <w:szCs w:val="22"/>
+          <w:rFonts w:ascii="Calibri" w:hAnsi="Calibri"/>
+          <w:color w:val="1F3A5F"/>
         </w:rPr>
-        <w:t>Git</w:t>
+        <w:t>0</w:t>
+      </w:r>
+      <w:r>
+        <w:fldChar w:fldCharType="end"/>
       </w:r>
     </w:p>
     <w:p>
       <w:pPr>
         <w:ind w:left="850"/>
-      </w:pPr>
+        <w:tabs>
+          <w:tab w:val="right" w:leader="dot" w:pos="9072"/>
+        </w:tabs>
+      </w:pPr>
+      <w:hyperlink w:anchor="GRACE_M-SEC138">
+        <w:r>
+          <w:rPr>
+            <w:sz w:val="22"/>
+            <w:szCs w:val="22"/>
+            <w:rFonts w:ascii="Calibri" w:hAnsi="Calibri"/>
+            <w:color w:val="1F3A5F"/>
+            <w:u w:val="single"/>
+          </w:rPr>
+          <w:t xml:space="preserve">Команды</w:t>
+        </w:r>
+      </w:hyperlink>
+      <w:r>
+        <w:tab/>
+      </w:r>
+      <w:r>
+        <w:fldChar w:fldCharType="begin"/>
+      </w:r>
+      <w:r>
+        <w:instrText xml:space="preserve"> PAGEREF GRACE_M-SEC138 \h </w:instrText>
+      </w:r>
+      <w:r>
+        <w:fldChar w:fldCharType="separate"/>
+      </w:r>
       <w:r>
         <w:rPr>
           <w:sz w:val="22"/>
+          <w:szCs w:val="22"/>
+          <w:rFonts w:ascii="Calibri" w:hAnsi="Calibri"/>
+          <w:color w:val="1F3A5F"/>
         </w:rPr>
-        <w:t>Команды</w:t>
+        <w:t>0</w:t>
+      </w:r>
+      <w:r>
+        <w:fldChar w:fldCharType="end"/>
       </w:r>
     </w:p>
     <w:p>
       <w:pPr>
         <w:ind w:left="850"/>
-      </w:pPr>
+        <w:tabs>
+          <w:tab w:val="right" w:leader="dot" w:pos="9072"/>
+        </w:tabs>
+      </w:pPr>
+      <w:hyperlink w:anchor="GRACE_M-SSH">
+        <w:r>
+          <w:rPr>
+            <w:sz w:val="22"/>
+            <w:szCs w:val="22"/>
+            <w:rFonts w:ascii="Calibri" w:hAnsi="Calibri"/>
+            <w:color w:val="1F3A5F"/>
+            <w:u w:val="single"/>
+          </w:rPr>
+          <w:t xml:space="preserve">SSH</w:t>
+        </w:r>
+      </w:hyperlink>
+      <w:r>
+        <w:tab/>
+      </w:r>
+      <w:r>
+        <w:fldChar w:fldCharType="begin"/>
+      </w:r>
+      <w:r>
+        <w:instrText xml:space="preserve"> PAGEREF GRACE_M-SSH \h </w:instrText>
+      </w:r>
+      <w:r>
+        <w:fldChar w:fldCharType="separate"/>
+      </w:r>
       <w:r>
         <w:rPr>
           <w:sz w:val="22"/>
+          <w:szCs w:val="22"/>
+          <w:rFonts w:ascii="Calibri" w:hAnsi="Calibri"/>
+          <w:color w:val="1F3A5F"/>
         </w:rPr>
-        <w:t>SSH</w:t>
+        <w:t>0</w:t>
+      </w:r>
+      <w:r>
+        <w:fldChar w:fldCharType="end"/>
       </w:r>
     </w:p>
     <w:p>
       <w:pPr>
         <w:ind w:left="850"/>
-      </w:pPr>
+        <w:tabs>
+          <w:tab w:val="right" w:leader="dot" w:pos="9072"/>
+        </w:tabs>
+      </w:pPr>
+      <w:hyperlink w:anchor="GRACE_M-GIT40">
+        <w:r>
+          <w:rPr>
+            <w:sz w:val="22"/>
+            <w:szCs w:val="22"/>
+            <w:rFonts w:ascii="Calibri" w:hAnsi="Calibri"/>
+            <w:color w:val="1F3A5F"/>
+            <w:u w:val="single"/>
+          </w:rPr>
+          <w:t xml:space="preserve">Исключения Git</w:t>
+        </w:r>
+      </w:hyperlink>
+      <w:r>
+        <w:tab/>
+      </w:r>
+      <w:r>
+        <w:fldChar w:fldCharType="begin"/>
+      </w:r>
+      <w:r>
+        <w:instrText xml:space="preserve"> PAGEREF GRACE_M-GIT40 \h </w:instrText>
+      </w:r>
+      <w:r>
+        <w:fldChar w:fldCharType="separate"/>
+      </w:r>
       <w:r>
         <w:rPr>
           <w:sz w:val="22"/>
+          <w:szCs w:val="22"/>
+          <w:rFonts w:ascii="Calibri" w:hAnsi="Calibri"/>
+          <w:color w:val="1F3A5F"/>
         </w:rPr>
-        <w:t>Исключения Git</w:t>
+        <w:t>0</w:t>
+      </w:r>
+      <w:r>
+        <w:fldChar w:fldCharType="end"/>
       </w:r>
     </w:p>
     <w:p>
       <w:pPr>
         <w:ind w:left="850"/>
-      </w:pPr>
+        <w:tabs>
+          <w:tab w:val="right" w:leader="dot" w:pos="9072"/>
+        </w:tabs>
+      </w:pPr>
+      <w:hyperlink w:anchor="GRACE_M-GIT41">
+        <w:r>
+          <w:rPr>
+            <w:sz w:val="22"/>
+            <w:szCs w:val="22"/>
+            <w:rFonts w:ascii="Calibri" w:hAnsi="Calibri"/>
+            <w:color w:val="1F3A5F"/>
+            <w:u w:val="single"/>
+          </w:rPr>
+          <w:t xml:space="preserve">Атрибуты Git</w:t>
+        </w:r>
+      </w:hyperlink>
+      <w:r>
+        <w:tab/>
+      </w:r>
+      <w:r>
+        <w:fldChar w:fldCharType="begin"/>
+      </w:r>
+      <w:r>
+        <w:instrText xml:space="preserve"> PAGEREF GRACE_M-GIT41 \h </w:instrText>
+      </w:r>
+      <w:r>
+        <w:fldChar w:fldCharType="separate"/>
+      </w:r>
       <w:r>
         <w:rPr>
           <w:sz w:val="22"/>
+          <w:szCs w:val="22"/>
+          <w:rFonts w:ascii="Calibri" w:hAnsi="Calibri"/>
+          <w:color w:val="1F3A5F"/>
         </w:rPr>
-        <w:t>Атрибуты Git</w:t>
+        <w:t>0</w:t>
+      </w:r>
+      <w:r>
+        <w:fldChar w:fldCharType="end"/>
       </w:r>
     </w:p>
     <w:p>
       <w:pPr>
         <w:ind w:left="850"/>
-      </w:pPr>
+        <w:tabs>
+          <w:tab w:val="right" w:leader="dot" w:pos="9072"/>
+        </w:tabs>
+      </w:pPr>
+      <w:hyperlink w:anchor="GRACE_M-LFS">
+        <w:r>
+          <w:rPr>
+            <w:sz w:val="22"/>
+            <w:szCs w:val="22"/>
+            <w:rFonts w:ascii="Calibri" w:hAnsi="Calibri"/>
+            <w:color w:val="1F3A5F"/>
+            <w:u w:val="single"/>
+          </w:rPr>
+          <w:t xml:space="preserve">Git LFS</w:t>
+        </w:r>
+      </w:hyperlink>
+      <w:r>
+        <w:tab/>
+      </w:r>
+      <w:r>
+        <w:fldChar w:fldCharType="begin"/>
+      </w:r>
+      <w:r>
+        <w:instrText xml:space="preserve"> PAGEREF GRACE_M-LFS \h </w:instrText>
+      </w:r>
+      <w:r>
+        <w:fldChar w:fldCharType="separate"/>
+      </w:r>
       <w:r>
         <w:rPr>
           <w:sz w:val="22"/>
+          <w:szCs w:val="22"/>
+          <w:rFonts w:ascii="Calibri" w:hAnsi="Calibri"/>
+          <w:color w:val="1F3A5F"/>
         </w:rPr>
-        <w:t>Git LFS</w:t>
+        <w:t>0</w:t>
+      </w:r>
+      <w:r>
+        <w:fldChar w:fldCharType="end"/>
       </w:r>
     </w:p>
     <w:p>
       <w:pPr>
         <w:ind w:left="850"/>
-      </w:pPr>
+        <w:tabs>
+          <w:tab w:val="right" w:leader="dot" w:pos="9072"/>
+        </w:tabs>
+      </w:pPr>
+      <w:hyperlink w:anchor="GRACE_M-SUBMO">
+        <w:r>
+          <w:rPr>
+            <w:sz w:val="22"/>
+            <w:szCs w:val="22"/>
+            <w:rFonts w:ascii="Calibri" w:hAnsi="Calibri"/>
+            <w:color w:val="1F3A5F"/>
+            <w:u w:val="single"/>
+          </w:rPr>
+          <w:t xml:space="preserve">Submodules</w:t>
+        </w:r>
+      </w:hyperlink>
+      <w:r>
+        <w:tab/>
+      </w:r>
+      <w:r>
+        <w:fldChar w:fldCharType="begin"/>
+      </w:r>
+      <w:r>
+        <w:instrText xml:space="preserve"> PAGEREF GRACE_M-SUBMO \h </w:instrText>
+      </w:r>
+      <w:r>
+        <w:fldChar w:fldCharType="separate"/>
+      </w:r>
       <w:r>
         <w:rPr>
           <w:sz w:val="22"/>
+          <w:szCs w:val="22"/>
+          <w:rFonts w:ascii="Calibri" w:hAnsi="Calibri"/>
+          <w:color w:val="1F3A5F"/>
         </w:rPr>
-        <w:t>Submodules</w:t>
+        <w:t>0</w:t>
+      </w:r>
+      <w:r>
+        <w:fldChar w:fldCharType="end"/>
       </w:r>
     </w:p>
     <w:p>
       <w:pPr>
         <w:ind w:left="850"/>
-      </w:pPr>
+        <w:tabs>
+          <w:tab w:val="right" w:leader="dot" w:pos="9072"/>
+        </w:tabs>
+      </w:pPr>
+      <w:hyperlink w:anchor="GRACE_M-GITFLOW">
+        <w:r>
+          <w:rPr>
+            <w:sz w:val="22"/>
+            <w:szCs w:val="22"/>
+            <w:rFonts w:ascii="Calibri" w:hAnsi="Calibri"/>
+            <w:color w:val="1F3A5F"/>
+            <w:u w:val="single"/>
+          </w:rPr>
+          <w:t xml:space="preserve">Git Flow</w:t>
+        </w:r>
+      </w:hyperlink>
+      <w:r>
+        <w:tab/>
+      </w:r>
+      <w:r>
+        <w:fldChar w:fldCharType="begin"/>
+      </w:r>
+      <w:r>
+        <w:instrText xml:space="preserve"> PAGEREF GRACE_M-GITFLOW \h </w:instrText>
+      </w:r>
+      <w:r>
+        <w:fldChar w:fldCharType="separate"/>
+      </w:r>
       <w:r>
         <w:rPr>
           <w:sz w:val="22"/>
+          <w:szCs w:val="22"/>
+          <w:rFonts w:ascii="Calibri" w:hAnsi="Calibri"/>
+          <w:color w:val="1F3A5F"/>
         </w:rPr>
-        <w:t>Git Flow</w:t>
+        <w:t>0</w:t>
+      </w:r>
+      <w:r>
+        <w:fldChar w:fldCharType="end"/>
       </w:r>
     </w:p>
     <w:p>
       <w:pPr>
         <w:ind w:left="0"/>
-      </w:pPr>
+        <w:tabs>
+          <w:tab w:val="right" w:leader="dot" w:pos="9072"/>
+        </w:tabs>
+      </w:pPr>
+      <w:hyperlink w:anchor="GRACE_M-SEC145">
+        <w:r>
+          <w:rPr>
+            <w:sz w:val="24"/>
+            <w:szCs w:val="24"/>
+            <w:rFonts w:ascii="Calibri" w:hAnsi="Calibri"/>
+            <w:b/>
+            <w:color w:val="1F3A5F"/>
+            <w:u w:val="single"/>
+          </w:rPr>
+          <w:t xml:space="preserve">Принципы разработки</w:t>
+        </w:r>
+      </w:hyperlink>
+      <w:r>
+        <w:tab/>
+      </w:r>
+      <w:r>
+        <w:fldChar w:fldCharType="begin"/>
+      </w:r>
+      <w:r>
+        <w:instrText xml:space="preserve"> PAGEREF GRACE_M-SEC145 \h </w:instrText>
+      </w:r>
+      <w:r>
+        <w:fldChar w:fldCharType="separate"/>
+      </w:r>
       <w:r>
         <w:rPr>
-          <w:b/>
           <w:sz w:val="24"/>
+          <w:szCs w:val="24"/>
+          <w:rFonts w:ascii="Calibri" w:hAnsi="Calibri"/>
+          <w:color w:val="1F3A5F"/>
         </w:rPr>
-        <w:t>Принципы разработки</w:t>
+        <w:t>0</w:t>
+      </w:r>
+      <w:r>
+        <w:fldChar w:fldCharType="end"/>
       </w:r>
     </w:p>
     <w:p>
       <w:pPr>
         <w:ind w:left="425"/>
-      </w:pPr>
+        <w:tabs>
+          <w:tab w:val="right" w:leader="dot" w:pos="9072"/>
+        </w:tabs>
+      </w:pPr>
+      <w:hyperlink w:anchor="GRACE_M-KISS">
+        <w:r>
+          <w:rPr>
+            <w:sz w:val="22"/>
+            <w:szCs w:val="22"/>
+            <w:rFonts w:ascii="Calibri" w:hAnsi="Calibri"/>
+            <w:color w:val="1F3A5F"/>
+            <w:u w:val="single"/>
+          </w:rPr>
+          <w:t xml:space="preserve">KISS</w:t>
+        </w:r>
+      </w:hyperlink>
+      <w:r>
+        <w:tab/>
+      </w:r>
+      <w:r>
+        <w:fldChar w:fldCharType="begin"/>
+      </w:r>
+      <w:r>
+        <w:instrText xml:space="preserve"> PAGEREF GRACE_M-KISS \h </w:instrText>
+      </w:r>
+      <w:r>
+        <w:fldChar w:fldCharType="separate"/>
+      </w:r>
       <w:r>
         <w:rPr>
           <w:sz w:val="22"/>
+          <w:szCs w:val="22"/>
+          <w:rFonts w:ascii="Calibri" w:hAnsi="Calibri"/>
+          <w:color w:val="1F3A5F"/>
         </w:rPr>
-        <w:t>KISS</w:t>
+        <w:t>0</w:t>
+      </w:r>
+      <w:r>
+        <w:fldChar w:fldCharType="end"/>
       </w:r>
     </w:p>
     <w:p>
       <w:pPr>
         <w:ind w:left="425"/>
-      </w:pPr>
+        <w:tabs>
+          <w:tab w:val="right" w:leader="dot" w:pos="9072"/>
+        </w:tabs>
+      </w:pPr>
+      <w:hyperlink w:anchor="GRACE_M-DRY">
+        <w:r>
+          <w:rPr>
+            <w:sz w:val="22"/>
+            <w:szCs w:val="22"/>
+            <w:rFonts w:ascii="Calibri" w:hAnsi="Calibri"/>
+            <w:color w:val="1F3A5F"/>
+            <w:u w:val="single"/>
+          </w:rPr>
+          <w:t xml:space="preserve">DRY</w:t>
+        </w:r>
+      </w:hyperlink>
+      <w:r>
+        <w:tab/>
+      </w:r>
+      <w:r>
+        <w:fldChar w:fldCharType="begin"/>
+      </w:r>
+      <w:r>
+        <w:instrText xml:space="preserve"> PAGEREF GRACE_M-DRY \h </w:instrText>
+      </w:r>
+      <w:r>
+        <w:fldChar w:fldCharType="separate"/>
+      </w:r>
       <w:r>
         <w:rPr>
           <w:sz w:val="22"/>
+          <w:szCs w:val="22"/>
+          <w:rFonts w:ascii="Calibri" w:hAnsi="Calibri"/>
+          <w:color w:val="1F3A5F"/>
         </w:rPr>
-        <w:t>DRY</w:t>
+        <w:t>0</w:t>
+      </w:r>
+      <w:r>
+        <w:fldChar w:fldCharType="end"/>
       </w:r>
     </w:p>
     <w:p>
       <w:pPr>
         <w:ind w:left="425"/>
-      </w:pPr>
+        <w:tabs>
+          <w:tab w:val="right" w:leader="dot" w:pos="9072"/>
+        </w:tabs>
+      </w:pPr>
+      <w:hyperlink w:anchor="GRACE_M-YAGNI">
+        <w:r>
+          <w:rPr>
+            <w:sz w:val="22"/>
+            <w:szCs w:val="22"/>
+            <w:rFonts w:ascii="Calibri" w:hAnsi="Calibri"/>
+            <w:color w:val="1F3A5F"/>
+            <w:u w:val="single"/>
+          </w:rPr>
+          <w:t xml:space="preserve">YAGNI</w:t>
+        </w:r>
+      </w:hyperlink>
+      <w:r>
+        <w:tab/>
+      </w:r>
+      <w:r>
+        <w:fldChar w:fldCharType="begin"/>
+      </w:r>
+      <w:r>
+        <w:instrText xml:space="preserve"> PAGEREF GRACE_M-YAGNI \h </w:instrText>
+      </w:r>
+      <w:r>
+        <w:fldChar w:fldCharType="separate"/>
+      </w:r>
       <w:r>
         <w:rPr>
           <w:sz w:val="22"/>
+          <w:szCs w:val="22"/>
+          <w:rFonts w:ascii="Calibri" w:hAnsi="Calibri"/>
+          <w:color w:val="1F3A5F"/>
         </w:rPr>
-        <w:t>YAGNI</w:t>
+        <w:t>0</w:t>
+      </w:r>
+      <w:r>
+        <w:fldChar w:fldCharType="end"/>
       </w:r>
     </w:p>
     <w:p>
       <w:pPr>
         <w:ind w:left="425"/>
-      </w:pPr>
+        <w:tabs>
+          <w:tab w:val="right" w:leader="dot" w:pos="9072"/>
+        </w:tabs>
+      </w:pPr>
+      <w:hyperlink w:anchor="GRACE_M-SOLID">
+        <w:r>
+          <w:rPr>
+            <w:sz w:val="22"/>
+            <w:szCs w:val="22"/>
+            <w:rFonts w:ascii="Calibri" w:hAnsi="Calibri"/>
+            <w:color w:val="1F3A5F"/>
+            <w:u w:val="single"/>
+          </w:rPr>
+          <w:t xml:space="preserve">SOLID</w:t>
+        </w:r>
+      </w:hyperlink>
+      <w:r>
+        <w:tab/>
+      </w:r>
+      <w:r>
+        <w:fldChar w:fldCharType="begin"/>
+      </w:r>
+      <w:r>
+        <w:instrText xml:space="preserve"> PAGEREF GRACE_M-SOLID \h </w:instrText>
+      </w:r>
+      <w:r>
+        <w:fldChar w:fldCharType="separate"/>
+      </w:r>
       <w:r>
         <w:rPr>
           <w:sz w:val="22"/>
+          <w:szCs w:val="22"/>
+          <w:rFonts w:ascii="Calibri" w:hAnsi="Calibri"/>
+          <w:color w:val="1F3A5F"/>
         </w:rPr>
-        <w:t>SOLID</w:t>
+        <w:t>0</w:t>
+      </w:r>
+      <w:r>
+        <w:fldChar w:fldCharType="end"/>
       </w:r>
     </w:p>
     <w:p>
       <w:pPr>
         <w:ind w:left="425"/>
-      </w:pPr>
+        <w:tabs>
+          <w:tab w:val="right" w:leader="dot" w:pos="9072"/>
+        </w:tabs>
+      </w:pPr>
+      <w:hyperlink w:anchor="GRACE_M-SEC150">
+        <w:r>
+          <w:rPr>
+            <w:sz w:val="22"/>
+            <w:szCs w:val="22"/>
+            <w:rFonts w:ascii="Calibri" w:hAnsi="Calibri"/>
+            <w:color w:val="1F3A5F"/>
+            <w:u w:val="single"/>
+          </w:rPr>
+          <w:t xml:space="preserve">Архитектура</w:t>
+        </w:r>
+      </w:hyperlink>
+      <w:r>
+        <w:tab/>
+      </w:r>
+      <w:r>
+        <w:fldChar w:fldCharType="begin"/>
+      </w:r>
+      <w:r>
+        <w:instrText xml:space="preserve"> PAGEREF GRACE_M-SEC150 \h </w:instrText>
+      </w:r>
+      <w:r>
+        <w:fldChar w:fldCharType="separate"/>
+      </w:r>
       <w:r>
         <w:rPr>
           <w:sz w:val="22"/>
+          <w:szCs w:val="22"/>
+          <w:rFonts w:ascii="Calibri" w:hAnsi="Calibri"/>
+          <w:color w:val="1F3A5F"/>
         </w:rPr>
-        <w:t>Архитектура</w:t>
+        <w:t>0</w:t>
+      </w:r>
+      <w:r>
+        <w:fldChar w:fldCharType="end"/>
       </w:r>
     </w:p>
     <w:p>
       <w:pPr>
         <w:ind w:left="425"/>
-      </w:pPr>
+        <w:tabs>
+          <w:tab w:val="right" w:leader="dot" w:pos="9072"/>
+        </w:tabs>
+      </w:pPr>
+      <w:hyperlink w:anchor="GRACE_M-SEC151">
+        <w:r>
+          <w:rPr>
+            <w:sz w:val="22"/>
+            <w:szCs w:val="22"/>
+            <w:rFonts w:ascii="Calibri" w:hAnsi="Calibri"/>
+            <w:color w:val="1F3A5F"/>
+            <w:u w:val="single"/>
+          </w:rPr>
+          <w:t xml:space="preserve">Принципы разработки</w:t>
+        </w:r>
+      </w:hyperlink>
+      <w:r>
+        <w:tab/>
+      </w:r>
+      <w:r>
+        <w:fldChar w:fldCharType="begin"/>
+      </w:r>
+      <w:r>
+        <w:instrText xml:space="preserve"> PAGEREF GRACE_M-SEC151 \h </w:instrText>
+      </w:r>
+      <w:r>
+        <w:fldChar w:fldCharType="separate"/>
+      </w:r>
       <w:r>
         <w:rPr>
           <w:sz w:val="22"/>
+          <w:szCs w:val="22"/>
+          <w:rFonts w:ascii="Calibri" w:hAnsi="Calibri"/>
+          <w:color w:val="1F3A5F"/>
         </w:rPr>
-        <w:t>Принципы разработки</w:t>
+        <w:t>0</w:t>
+      </w:r>
+      <w:r>
+        <w:fldChar w:fldCharType="end"/>
       </w:r>
     </w:p>
     <w:p>
       <w:pPr>
         <w:ind w:left="0"/>
-      </w:pPr>
+        <w:tabs>
+          <w:tab w:val="right" w:leader="dot" w:pos="9072"/>
+        </w:tabs>
+      </w:pPr>
+      <w:hyperlink w:anchor="GRACE_M-INTEG">
+        <w:r>
+          <w:rPr>
+            <w:sz w:val="24"/>
+            <w:szCs w:val="24"/>
+            <w:rFonts w:ascii="Calibri" w:hAnsi="Calibri"/>
+            <w:b/>
+            <w:color w:val="1F3A5F"/>
+            <w:u w:val="single"/>
+          </w:rPr>
+          <w:t xml:space="preserve">Интеграции</w:t>
+        </w:r>
+      </w:hyperlink>
+      <w:r>
+        <w:tab/>
+      </w:r>
+      <w:r>
+        <w:fldChar w:fldCharType="begin"/>
+      </w:r>
+      <w:r>
+        <w:instrText xml:space="preserve"> PAGEREF GRACE_M-INTEG \h </w:instrText>
+      </w:r>
+      <w:r>
+        <w:fldChar w:fldCharType="separate"/>
+      </w:r>
       <w:r>
         <w:rPr>
-          <w:b/>
           <w:sz w:val="24"/>
+          <w:szCs w:val="24"/>
+          <w:rFonts w:ascii="Calibri" w:hAnsi="Calibri"/>
+          <w:color w:val="1F3A5F"/>
         </w:rPr>
-        <w:t>Интеграции</w:t>
+        <w:t>0</w:t>
+      </w:r>
+      <w:r>
+        <w:fldChar w:fldCharType="end"/>
       </w:r>
     </w:p>
     <w:p>
       <w:pPr>
         <w:ind w:left="425"/>
-      </w:pPr>
+        <w:tabs>
+          <w:tab w:val="right" w:leader="dot" w:pos="9072"/>
+        </w:tabs>
+      </w:pPr>
+      <w:hyperlink w:anchor="GRACE_M-INTEG-2">
+        <w:r>
+          <w:rPr>
+            <w:sz w:val="22"/>
+            <w:szCs w:val="22"/>
+            <w:rFonts w:ascii="Calibri" w:hAnsi="Calibri"/>
+            <w:color w:val="1F3A5F"/>
+            <w:u w:val="single"/>
+          </w:rPr>
+          <w:t xml:space="preserve">Интеграции</w:t>
+        </w:r>
+      </w:hyperlink>
+      <w:r>
+        <w:tab/>
+      </w:r>
+      <w:r>
+        <w:fldChar w:fldCharType="begin"/>
+      </w:r>
+      <w:r>
+        <w:instrText xml:space="preserve"> PAGEREF GRACE_M-INTEG-2 \h </w:instrText>
+      </w:r>
+      <w:r>
+        <w:fldChar w:fldCharType="separate"/>
+      </w:r>
       <w:r>
         <w:rPr>
           <w:sz w:val="22"/>
+          <w:szCs w:val="22"/>
+          <w:rFonts w:ascii="Calibri" w:hAnsi="Calibri"/>
+          <w:color w:val="1F3A5F"/>
         </w:rPr>
-        <w:t>Интеграции</w:t>
+        <w:t>0</w:t>
+      </w:r>
+      <w:r>
+        <w:fldChar w:fldCharType="end"/>
       </w:r>
     </w:p>
     <w:p>
       <w:pPr>
         <w:ind w:left="425"/>
-      </w:pPr>
+        <w:tabs>
+          <w:tab w:val="right" w:leader="dot" w:pos="9072"/>
+        </w:tabs>
+      </w:pPr>
+      <w:hyperlink w:anchor="GRACE_M-MSG">
+        <w:r>
+          <w:rPr>
+            <w:sz w:val="22"/>
+            <w:szCs w:val="22"/>
+            <w:rFonts w:ascii="Calibri" w:hAnsi="Calibri"/>
+            <w:color w:val="1F3A5F"/>
+            <w:u w:val="single"/>
+          </w:rPr>
+          <w:t xml:space="preserve">Брокеры сообщений</w:t>
+        </w:r>
+      </w:hyperlink>
+      <w:r>
+        <w:tab/>
+      </w:r>
+      <w:r>
+        <w:fldChar w:fldCharType="begin"/>
+      </w:r>
+      <w:r>
+        <w:instrText xml:space="preserve"> PAGEREF GRACE_M-MSG \h </w:instrText>
+      </w:r>
+      <w:r>
+        <w:fldChar w:fldCharType="separate"/>
+      </w:r>
       <w:r>
         <w:rPr>
           <w:sz w:val="22"/>
+          <w:szCs w:val="22"/>
+          <w:rFonts w:ascii="Calibri" w:hAnsi="Calibri"/>
+          <w:color w:val="1F3A5F"/>
         </w:rPr>
-        <w:t>Брокеры сообщений</w:t>
+        <w:t>0</w:t>
+      </w:r>
+      <w:r>
+        <w:fldChar w:fldCharType="end"/>
       </w:r>
     </w:p>
     <w:p>
       <w:pPr>
         <w:ind w:left="850"/>
-      </w:pPr>
+        <w:tabs>
+          <w:tab w:val="right" w:leader="dot" w:pos="9072"/>
+        </w:tabs>
+      </w:pPr>
+      <w:hyperlink w:anchor="GRACE_M-MSG-2">
+        <w:r>
+          <w:rPr>
+            <w:sz w:val="22"/>
+            <w:szCs w:val="22"/>
+            <w:rFonts w:ascii="Calibri" w:hAnsi="Calibri"/>
+            <w:color w:val="1F3A5F"/>
+            <w:u w:val="single"/>
+          </w:rPr>
+          <w:t xml:space="preserve">Брокеры сообщений</w:t>
+        </w:r>
+      </w:hyperlink>
+      <w:r>
+        <w:tab/>
+      </w:r>
+      <w:r>
+        <w:fldChar w:fldCharType="begin"/>
+      </w:r>
+      <w:r>
+        <w:instrText xml:space="preserve"> PAGEREF GRACE_M-MSG-2 \h </w:instrText>
+      </w:r>
+      <w:r>
+        <w:fldChar w:fldCharType="separate"/>
+      </w:r>
       <w:r>
         <w:rPr>
           <w:sz w:val="22"/>
+          <w:szCs w:val="22"/>
+          <w:rFonts w:ascii="Calibri" w:hAnsi="Calibri"/>
+          <w:color w:val="1F3A5F"/>
         </w:rPr>
-        <w:t>Брокеры сообщений</w:t>
+        <w:t>0</w:t>
+      </w:r>
+      <w:r>
+        <w:fldChar w:fldCharType="end"/>
       </w:r>
     </w:p>
     <w:p>
       <w:pPr>
         <w:ind w:left="850"/>
-      </w:pPr>
+        <w:tabs>
+          <w:tab w:val="right" w:leader="dot" w:pos="9072"/>
+        </w:tabs>
+      </w:pPr>
+      <w:hyperlink w:anchor="GRACE_M-RMQ">
+        <w:r>
+          <w:rPr>
+            <w:sz w:val="22"/>
+            <w:szCs w:val="22"/>
+            <w:rFonts w:ascii="Calibri" w:hAnsi="Calibri"/>
+            <w:color w:val="1F3A5F"/>
+            <w:u w:val="single"/>
+          </w:rPr>
+          <w:t xml:space="preserve">RabbitMQ</w:t>
+        </w:r>
+      </w:hyperlink>
+      <w:r>
+        <w:tab/>
+      </w:r>
+      <w:r>
+        <w:fldChar w:fldCharType="begin"/>
+      </w:r>
+      <w:r>
+        <w:instrText xml:space="preserve"> PAGEREF GRACE_M-RMQ \h </w:instrText>
+      </w:r>
+      <w:r>
+        <w:fldChar w:fldCharType="separate"/>
+      </w:r>
       <w:r>
         <w:rPr>
           <w:sz w:val="22"/>
+          <w:szCs w:val="22"/>
+          <w:rFonts w:ascii="Calibri" w:hAnsi="Calibri"/>
+          <w:color w:val="1F3A5F"/>
         </w:rPr>
-        <w:t>RabbitMQ</w:t>
+        <w:t>0</w:t>
+      </w:r>
+      <w:r>
+        <w:fldChar w:fldCharType="end"/>
       </w:r>
     </w:p>
     <w:p>
       <w:pPr>
         <w:ind w:left="1276"/>
-      </w:pPr>
+        <w:tabs>
+          <w:tab w:val="right" w:leader="dot" w:pos="9072"/>
+        </w:tabs>
+      </w:pPr>
+      <w:hyperlink w:anchor="GRACE_M-RMQCON">
+        <w:r>
+          <w:rPr>
+            <w:sz w:val="22"/>
+            <w:szCs w:val="22"/>
+            <w:rFonts w:ascii="Calibri" w:hAnsi="Calibri"/>
+            <w:color w:val="1F3A5F"/>
+            <w:u w:val="single"/>
+          </w:rPr>
+          <w:t xml:space="preserve">Основные концепции</w:t>
+        </w:r>
+      </w:hyperlink>
+      <w:r>
+        <w:tab/>
+      </w:r>
+      <w:r>
+        <w:fldChar w:fldCharType="begin"/>
+      </w:r>
+      <w:r>
+        <w:instrText xml:space="preserve"> PAGEREF GRACE_M-RMQCON \h </w:instrText>
+      </w:r>
+      <w:r>
+        <w:fldChar w:fldCharType="separate"/>
+      </w:r>
       <w:r>
         <w:rPr>
           <w:sz w:val="22"/>
+          <w:szCs w:val="22"/>
+          <w:rFonts w:ascii="Calibri" w:hAnsi="Calibri"/>
+          <w:color w:val="1F3A5F"/>
         </w:rPr>
-        <w:t>Основные концепции</w:t>
+        <w:t>0</w:t>
+      </w:r>
+      <w:r>
+        <w:fldChar w:fldCharType="end"/>
       </w:r>
     </w:p>
     <w:p>
       <w:pPr>
         <w:ind w:left="1276"/>
-      </w:pPr>
+        <w:tabs>
+          <w:tab w:val="right" w:leader="dot" w:pos="9072"/>
+        </w:tabs>
+      </w:pPr>
+      <w:hyperlink w:anchor="GRACE_M-RMQ-2">
+        <w:r>
+          <w:rPr>
+            <w:sz w:val="22"/>
+            <w:szCs w:val="22"/>
+            <w:rFonts w:ascii="Calibri" w:hAnsi="Calibri"/>
+            <w:color w:val="1F3A5F"/>
+            <w:u w:val="single"/>
+          </w:rPr>
+          <w:t xml:space="preserve">RabbitMQ</w:t>
+        </w:r>
+      </w:hyperlink>
+      <w:r>
+        <w:tab/>
+      </w:r>
+      <w:r>
+        <w:fldChar w:fldCharType="begin"/>
+      </w:r>
+      <w:r>
+        <w:instrText xml:space="preserve"> PAGEREF GRACE_M-RMQ-2 \h </w:instrText>
+      </w:r>
+      <w:r>
+        <w:fldChar w:fldCharType="separate"/>
+      </w:r>
       <w:r>
         <w:rPr>
           <w:sz w:val="22"/>
+          <w:szCs w:val="22"/>
+          <w:rFonts w:ascii="Calibri" w:hAnsi="Calibri"/>
+          <w:color w:val="1F3A5F"/>
         </w:rPr>
-        <w:t>RabbitMQ</w:t>
+        <w:t>0</w:t>
+      </w:r>
+      <w:r>
+        <w:fldChar w:fldCharType="end"/>
       </w:r>
     </w:p>
     <w:p>
       <w:pPr>
         <w:ind w:left="1276"/>
-      </w:pPr>
+        <w:tabs>
+          <w:tab w:val="right" w:leader="dot" w:pos="9072"/>
+        </w:tabs>
+      </w:pPr>
+      <w:hyperlink w:anchor="GRACE_M-RMQNAM">
+        <w:r>
+          <w:rPr>
+            <w:sz w:val="22"/>
+            <w:szCs w:val="22"/>
+            <w:rFonts w:ascii="Calibri" w:hAnsi="Calibri"/>
+            <w:color w:val="1F3A5F"/>
+            <w:u w:val="single"/>
+          </w:rPr>
+          <w:t xml:space="preserve">Регламент именования</w:t>
+        </w:r>
+      </w:hyperlink>
+      <w:r>
+        <w:tab/>
+      </w:r>
+      <w:r>
+        <w:fldChar w:fldCharType="begin"/>
+      </w:r>
+      <w:r>
+        <w:instrText xml:space="preserve"> PAGEREF GRACE_M-RMQNAM \h </w:instrText>
+      </w:r>
+      <w:r>
+        <w:fldChar w:fldCharType="separate"/>
+      </w:r>
       <w:r>
         <w:rPr>
           <w:sz w:val="22"/>
+          <w:szCs w:val="22"/>
+          <w:rFonts w:ascii="Calibri" w:hAnsi="Calibri"/>
+          <w:color w:val="1F3A5F"/>
         </w:rPr>
-        <w:t>Регламент именования</w:t>
+        <w:t>0</w:t>
+      </w:r>
+      <w:r>
+        <w:fldChar w:fldCharType="end"/>
       </w:r>
     </w:p>
     <w:p>
       <w:pPr>
         <w:ind w:left="1276"/>
-      </w:pPr>
+        <w:tabs>
+          <w:tab w:val="right" w:leader="dot" w:pos="9072"/>
+        </w:tabs>
+      </w:pPr>
+      <w:hyperlink w:anchor="GRACE_M-BITADPT">
+        <w:r>
+          <w:rPr>
+            <w:sz w:val="22"/>
+            <w:szCs w:val="22"/>
+            <w:rFonts w:ascii="Calibri" w:hAnsi="Calibri"/>
+            <w:color w:val="1F3A5F"/>
+            <w:u w:val="single"/>
+          </w:rPr>
+          <w:t xml:space="preserve">БИТ.Адаптер</w:t>
+        </w:r>
+      </w:hyperlink>
+      <w:r>
+        <w:tab/>
+      </w:r>
+      <w:r>
+        <w:fldChar w:fldCharType="begin"/>
+      </w:r>
+      <w:r>
+        <w:instrText xml:space="preserve"> PAGEREF GRACE_M-BITADPT \h </w:instrText>
+      </w:r>
+      <w:r>
+        <w:fldChar w:fldCharType="separate"/>
+      </w:r>
       <w:r>
         <w:rPr>
           <w:sz w:val="22"/>
+          <w:szCs w:val="22"/>
+          <w:rFonts w:ascii="Calibri" w:hAnsi="Calibri"/>
+          <w:color w:val="1F3A5F"/>
         </w:rPr>
-        <w:t>БИТ.Адаптер</w:t>
+        <w:t>0</w:t>
+      </w:r>
+      <w:r>
+        <w:fldChar w:fldCharType="end"/>
       </w:r>
     </w:p>
     <w:p>
       <w:pPr>
         <w:ind w:left="1701"/>
-      </w:pPr>
+        <w:tabs>
+          <w:tab w:val="right" w:leader="dot" w:pos="9072"/>
+        </w:tabs>
+      </w:pPr>
+      <w:hyperlink w:anchor="GRACE_M-BITADPT-2">
+        <w:r>
+          <w:rPr>
+            <w:sz w:val="22"/>
+            <w:szCs w:val="22"/>
+            <w:rFonts w:ascii="Calibri" w:hAnsi="Calibri"/>
+            <w:color w:val="1F3A5F"/>
+            <w:u w:val="single"/>
+          </w:rPr>
+          <w:t xml:space="preserve">БИТ.Адаптер</w:t>
+        </w:r>
+      </w:hyperlink>
+      <w:r>
+        <w:tab/>
+      </w:r>
+      <w:r>
+        <w:fldChar w:fldCharType="begin"/>
+      </w:r>
+      <w:r>
+        <w:instrText xml:space="preserve"> PAGEREF GRACE_M-BITADPT-2 \h </w:instrText>
+      </w:r>
+      <w:r>
+        <w:fldChar w:fldCharType="separate"/>
+      </w:r>
       <w:r>
         <w:rPr>
           <w:sz w:val="22"/>
+          <w:szCs w:val="22"/>
+          <w:rFonts w:ascii="Calibri" w:hAnsi="Calibri"/>
+          <w:color w:val="1F3A5F"/>
         </w:rPr>
-        <w:t>БИТ.Адаптер</w:t>
+        <w:t>0</w:t>
+      </w:r>
+      <w:r>
+        <w:fldChar w:fldCharType="end"/>
       </w:r>
     </w:p>
     <w:p>
       <w:pPr>
         <w:ind w:left="850"/>
-      </w:pPr>
+        <w:tabs>
+          <w:tab w:val="right" w:leader="dot" w:pos="9072"/>
+        </w:tabs>
+      </w:pPr>
+      <w:hyperlink w:anchor="GRACE_M-KAFKA">
+        <w:r>
+          <w:rPr>
+            <w:sz w:val="22"/>
+            <w:szCs w:val="22"/>
+            <w:rFonts w:ascii="Calibri" w:hAnsi="Calibri"/>
+            <w:color w:val="1F3A5F"/>
+            <w:u w:val="single"/>
+          </w:rPr>
+          <w:t xml:space="preserve">Kafka</w:t>
+        </w:r>
+      </w:hyperlink>
+      <w:r>
+        <w:tab/>
+      </w:r>
+      <w:r>
+        <w:fldChar w:fldCharType="begin"/>
+      </w:r>
+      <w:r>
+        <w:instrText xml:space="preserve"> PAGEREF GRACE_M-KAFKA \h </w:instrText>
+      </w:r>
+      <w:r>
+        <w:fldChar w:fldCharType="separate"/>
+      </w:r>
       <w:r>
         <w:rPr>
           <w:sz w:val="22"/>
+          <w:szCs w:val="22"/>
+          <w:rFonts w:ascii="Calibri" w:hAnsi="Calibri"/>
+          <w:color w:val="1F3A5F"/>
         </w:rPr>
-        <w:t>Kafka</w:t>
+        <w:t>0</w:t>
+      </w:r>
+      <w:r>
+        <w:fldChar w:fldCharType="end"/>
       </w:r>
     </w:p>
     <w:p>
       <w:pPr>
         <w:ind w:left="1276"/>
-      </w:pPr>
+        <w:tabs>
+          <w:tab w:val="right" w:leader="dot" w:pos="9072"/>
+        </w:tabs>
+      </w:pPr>
+      <w:hyperlink w:anchor="GRACE_M-KAFKA-2">
+        <w:r>
+          <w:rPr>
+            <w:sz w:val="22"/>
+            <w:szCs w:val="22"/>
+            <w:rFonts w:ascii="Calibri" w:hAnsi="Calibri"/>
+            <w:color w:val="1F3A5F"/>
+            <w:u w:val="single"/>
+          </w:rPr>
+          <w:t xml:space="preserve">Apache Kafka</w:t>
+        </w:r>
+      </w:hyperlink>
+      <w:r>
+        <w:tab/>
+      </w:r>
+      <w:r>
+        <w:fldChar w:fldCharType="begin"/>
+      </w:r>
+      <w:r>
+        <w:instrText xml:space="preserve"> PAGEREF GRACE_M-KAFKA-2 \h </w:instrText>
+      </w:r>
+      <w:r>
+        <w:fldChar w:fldCharType="separate"/>
+      </w:r>
       <w:r>
         <w:rPr>
           <w:sz w:val="22"/>
+          <w:szCs w:val="22"/>
+          <w:rFonts w:ascii="Calibri" w:hAnsi="Calibri"/>
+          <w:color w:val="1F3A5F"/>
         </w:rPr>
-        <w:t>Apache Kafka</w:t>
+        <w:t>0</w:t>
+      </w:r>
+      <w:r>
+        <w:fldChar w:fldCharType="end"/>
       </w:r>
     </w:p>
     <w:p>
       <w:pPr>
         <w:ind w:left="0"/>
-      </w:pPr>
+        <w:tabs>
+          <w:tab w:val="right" w:leader="dot" w:pos="9072"/>
+        </w:tabs>
+      </w:pPr>
+      <w:hyperlink w:anchor="GRACE_M-SEC164">
+        <w:r>
+          <w:rPr>
+            <w:sz w:val="24"/>
+            <w:szCs w:val="24"/>
+            <w:rFonts w:ascii="Calibri" w:hAnsi="Calibri"/>
+            <w:b/>
+            <w:color w:val="1F3A5F"/>
+            <w:u w:val="single"/>
+          </w:rPr>
+          <w:t xml:space="preserve">Руководства</w:t>
+        </w:r>
+      </w:hyperlink>
+      <w:r>
+        <w:tab/>
+      </w:r>
+      <w:r>
+        <w:fldChar w:fldCharType="begin"/>
+      </w:r>
+      <w:r>
+        <w:instrText xml:space="preserve"> PAGEREF GRACE_M-SEC164 \h </w:instrText>
+      </w:r>
+      <w:r>
+        <w:fldChar w:fldCharType="separate"/>
+      </w:r>
       <w:r>
         <w:rPr>
-          <w:b/>
           <w:sz w:val="24"/>
+          <w:szCs w:val="24"/>
+          <w:rFonts w:ascii="Calibri" w:hAnsi="Calibri"/>
+          <w:color w:val="1F3A5F"/>
         </w:rPr>
-        <w:t>Руководства</w:t>
+        <w:t>0</w:t>
+      </w:r>
+      <w:r>
+        <w:fldChar w:fldCharType="end"/>
       </w:r>
     </w:p>
     <w:p>
       <w:pPr>
         <w:ind w:left="425"/>
-      </w:pPr>
+        <w:tabs>
+          <w:tab w:val="right" w:leader="dot" w:pos="9072"/>
+        </w:tabs>
+      </w:pPr>
+      <w:hyperlink w:anchor="GRACE_M-ENV">
+        <w:r>
+          <w:rPr>
+            <w:sz w:val="22"/>
+            <w:szCs w:val="22"/>
+            <w:rFonts w:ascii="Calibri" w:hAnsi="Calibri"/>
+            <w:color w:val="1F3A5F"/>
+            <w:u w:val="single"/>
+          </w:rPr>
+          <w:t xml:space="preserve">Окружения</w:t>
+        </w:r>
+      </w:hyperlink>
+      <w:r>
+        <w:tab/>
+      </w:r>
+      <w:r>
+        <w:fldChar w:fldCharType="begin"/>
+      </w:r>
+      <w:r>
+        <w:instrText xml:space="preserve"> PAGEREF GRACE_M-ENV \h </w:instrText>
+      </w:r>
+      <w:r>
+        <w:fldChar w:fldCharType="separate"/>
+      </w:r>
       <w:r>
         <w:rPr>
           <w:sz w:val="22"/>
+          <w:szCs w:val="22"/>
+          <w:rFonts w:ascii="Calibri" w:hAnsi="Calibri"/>
+          <w:color w:val="1F3A5F"/>
         </w:rPr>
-        <w:t>Окружения</w:t>
+        <w:t>0</w:t>
+      </w:r>
+      <w:r>
+        <w:fldChar w:fldCharType="end"/>
       </w:r>
     </w:p>
     <w:p>
       <w:pPr>
         <w:ind w:left="425"/>
-      </w:pPr>
+        <w:tabs>
+          <w:tab w:val="right" w:leader="dot" w:pos="9072"/>
+        </w:tabs>
+      </w:pPr>
+      <w:hyperlink w:anchor="GRACE_M-UPDATE">
+        <w:r>
+          <w:rPr>
+            <w:sz w:val="22"/>
+            <w:szCs w:val="22"/>
+            <w:rFonts w:ascii="Calibri" w:hAnsi="Calibri"/>
+            <w:color w:val="1F3A5F"/>
+            <w:u w:val="single"/>
+          </w:rPr>
+          <w:t xml:space="preserve">Обновление конфигураций</w:t>
+        </w:r>
+      </w:hyperlink>
+      <w:r>
+        <w:tab/>
+      </w:r>
+      <w:r>
+        <w:fldChar w:fldCharType="begin"/>
+      </w:r>
+      <w:r>
+        <w:instrText xml:space="preserve"> PAGEREF GRACE_M-UPDATE \h </w:instrText>
+      </w:r>
+      <w:r>
+        <w:fldChar w:fldCharType="separate"/>
+      </w:r>
       <w:r>
         <w:rPr>
           <w:sz w:val="22"/>
+          <w:szCs w:val="22"/>
+          <w:rFonts w:ascii="Calibri" w:hAnsi="Calibri"/>
+          <w:color w:val="1F3A5F"/>
         </w:rPr>
-        <w:t>Обновление конфигураций</w:t>
+        <w:t>0</w:t>
+      </w:r>
+      <w:r>
+        <w:fldChar w:fldCharType="end"/>
       </w:r>
     </w:p>
     <w:p>
       <w:pPr>
         <w:ind w:left="425"/>
-      </w:pPr>
+        <w:tabs>
+          <w:tab w:val="right" w:leader="dot" w:pos="9072"/>
+        </w:tabs>
+      </w:pPr>
+      <w:hyperlink w:anchor="GRACE_M-TASK">
+        <w:r>
+          <w:rPr>
+            <w:sz w:val="22"/>
+            <w:szCs w:val="22"/>
+            <w:rFonts w:ascii="Calibri" w:hAnsi="Calibri"/>
+            <w:color w:val="1F3A5F"/>
+            <w:u w:val="single"/>
+          </w:rPr>
+          <w:t xml:space="preserve">Жизненный цикл задачи</w:t>
+        </w:r>
+      </w:hyperlink>
+      <w:r>
+        <w:tab/>
+      </w:r>
+      <w:r>
+        <w:fldChar w:fldCharType="begin"/>
+      </w:r>
+      <w:r>
+        <w:instrText xml:space="preserve"> PAGEREF GRACE_M-TASK \h </w:instrText>
+      </w:r>
+      <w:r>
+        <w:fldChar w:fldCharType="separate"/>
+      </w:r>
       <w:r>
         <w:rPr>
           <w:sz w:val="22"/>
+          <w:szCs w:val="22"/>
+          <w:rFonts w:ascii="Calibri" w:hAnsi="Calibri"/>
+          <w:color w:val="1F3A5F"/>
         </w:rPr>
-        <w:t>Жизненный цикл задачи</w:t>
+        <w:t>0</w:t>
+      </w:r>
+      <w:r>
+        <w:fldChar w:fldCharType="end"/>
       </w:r>
     </w:p>
     <w:p>
       <w:pPr>
         <w:ind w:left="425"/>
-      </w:pPr>
+        <w:tabs>
+          <w:tab w:val="right" w:leader="dot" w:pos="9072"/>
+        </w:tabs>
+      </w:pPr>
+      <w:hyperlink w:anchor="GRACE_M-SEC168">
+        <w:r>
+          <w:rPr>
+            <w:sz w:val="22"/>
+            <w:szCs w:val="22"/>
+            <w:rFonts w:ascii="Calibri" w:hAnsi="Calibri"/>
+            <w:color w:val="1F3A5F"/>
+            <w:u w:val="single"/>
+          </w:rPr>
+          <w:t xml:space="preserve">Руководства</w:t>
+        </w:r>
+      </w:hyperlink>
+      <w:r>
+        <w:tab/>
+      </w:r>
+      <w:r>
+        <w:fldChar w:fldCharType="begin"/>
+      </w:r>
+      <w:r>
+        <w:instrText xml:space="preserve"> PAGEREF GRACE_M-SEC168 \h </w:instrText>
+      </w:r>
+      <w:r>
+        <w:fldChar w:fldCharType="separate"/>
+      </w:r>
       <w:r>
         <w:rPr>
           <w:sz w:val="22"/>
+          <w:szCs w:val="22"/>
+          <w:rFonts w:ascii="Calibri" w:hAnsi="Calibri"/>
+          <w:color w:val="1F3A5F"/>
         </w:rPr>
-        <w:t>Руководства</w:t>
+        <w:t>0</w:t>
+      </w:r>
+      <w:r>
+        <w:fldChar w:fldCharType="end"/>
       </w:r>
     </w:p>
     <w:p>
       <w:pPr>
         <w:ind w:left="425"/>
-      </w:pPr>
+        <w:tabs>
+          <w:tab w:val="right" w:leader="dot" w:pos="9072"/>
+        </w:tabs>
+      </w:pPr>
+      <w:hyperlink w:anchor="GRACE_M-USERS">
+        <w:r>
+          <w:rPr>
+            <w:sz w:val="22"/>
+            <w:szCs w:val="22"/>
+            <w:rFonts w:ascii="Calibri" w:hAnsi="Calibri"/>
+            <w:color w:val="1F3A5F"/>
+            <w:u w:val="single"/>
+          </w:rPr>
+          <w:t xml:space="preserve">users</w:t>
+        </w:r>
+      </w:hyperlink>
+      <w:r>
+        <w:tab/>
+      </w:r>
+      <w:r>
+        <w:fldChar w:fldCharType="begin"/>
+      </w:r>
+      <w:r>
+        <w:instrText xml:space="preserve"> PAGEREF GRACE_M-USERS \h </w:instrText>
+      </w:r>
+      <w:r>
+        <w:fldChar w:fldCharType="separate"/>
+      </w:r>
       <w:r>
         <w:rPr>
           <w:sz w:val="22"/>
+          <w:szCs w:val="22"/>
+          <w:rFonts w:ascii="Calibri" w:hAnsi="Calibri"/>
+          <w:color w:val="1F3A5F"/>
         </w:rPr>
-        <w:t>users</w:t>
+        <w:t>0</w:t>
+      </w:r>
+      <w:r>
+        <w:fldChar w:fldCharType="end"/>
       </w:r>
     </w:p>
     <w:p>
       <w:pPr>
         <w:ind w:left="0"/>
-      </w:pPr>
+        <w:tabs>
+          <w:tab w:val="right" w:leader="dot" w:pos="9072"/>
+        </w:tabs>
+      </w:pPr>
+      <w:hyperlink w:anchor="GRACE_M-IDE">
+        <w:r>
+          <w:rPr>
+            <w:sz w:val="24"/>
+            <w:szCs w:val="24"/>
+            <w:rFonts w:ascii="Calibri" w:hAnsi="Calibri"/>
+            <w:b/>
+            <w:color w:val="1F3A5F"/>
+            <w:u w:val="single"/>
+          </w:rPr>
+          <w:t xml:space="preserve">IDE</w:t>
+        </w:r>
+      </w:hyperlink>
+      <w:r>
+        <w:tab/>
+      </w:r>
+      <w:r>
+        <w:fldChar w:fldCharType="begin"/>
+      </w:r>
+      <w:r>
+        <w:instrText xml:space="preserve"> PAGEREF GRACE_M-IDE \h </w:instrText>
+      </w:r>
+      <w:r>
+        <w:fldChar w:fldCharType="separate"/>
+      </w:r>
       <w:r>
         <w:rPr>
-          <w:b/>
           <w:sz w:val="24"/>
+          <w:szCs w:val="24"/>
+          <w:rFonts w:ascii="Calibri" w:hAnsi="Calibri"/>
+          <w:color w:val="1F3A5F"/>
         </w:rPr>
-        <w:t>IDE</w:t>
+        <w:t>0</w:t>
+      </w:r>
+      <w:r>
+        <w:fldChar w:fldCharType="end"/>
       </w:r>
     </w:p>
     <w:p>
       <w:pPr>
         <w:ind w:left="425"/>
-      </w:pPr>
+        <w:tabs>
+          <w:tab w:val="right" w:leader="dot" w:pos="9072"/>
+        </w:tabs>
+      </w:pPr>
+      <w:hyperlink w:anchor="GRACE_M-PHOENIX">
+        <w:r>
+          <w:rPr>
+            <w:sz w:val="22"/>
+            <w:szCs w:val="22"/>
+            <w:rFonts w:ascii="Calibri" w:hAnsi="Calibri"/>
+            <w:color w:val="1F3A5F"/>
+            <w:u w:val="single"/>
+          </w:rPr>
+          <w:t xml:space="preserve">Phoenix BSL</w:t>
+        </w:r>
+      </w:hyperlink>
+      <w:r>
+        <w:tab/>
+      </w:r>
+      <w:r>
+        <w:fldChar w:fldCharType="begin"/>
+      </w:r>
+      <w:r>
+        <w:instrText xml:space="preserve"> PAGEREF GRACE_M-PHOENIX \h </w:instrText>
+      </w:r>
+      <w:r>
+        <w:fldChar w:fldCharType="separate"/>
+      </w:r>
       <w:r>
         <w:rPr>
           <w:sz w:val="22"/>
+          <w:szCs w:val="22"/>
+          <w:rFonts w:ascii="Calibri" w:hAnsi="Calibri"/>
+          <w:color w:val="1F3A5F"/>
         </w:rPr>
-        <w:t>Phoenix BSL</w:t>
+        <w:t>0</w:t>
+      </w:r>
+      <w:r>
+        <w:fldChar w:fldCharType="end"/>
       </w:r>
     </w:p>
     <w:p>
       <w:pPr>
         <w:ind w:left="425"/>
-      </w:pPr>
+        <w:tabs>
+          <w:tab w:val="right" w:leader="dot" w:pos="9072"/>
+        </w:tabs>
+      </w:pPr>
+      <w:hyperlink w:anchor="GRACE_M-VSCOD">
+        <w:r>
+          <w:rPr>
+            <w:sz w:val="22"/>
+            <w:szCs w:val="22"/>
+            <w:rFonts w:ascii="Calibri" w:hAnsi="Calibri"/>
+            <w:color w:val="1F3A5F"/>
+            <w:u w:val="single"/>
+          </w:rPr>
+          <w:t xml:space="preserve">VS Code</w:t>
+        </w:r>
+      </w:hyperlink>
+      <w:r>
+        <w:tab/>
+      </w:r>
+      <w:r>
+        <w:fldChar w:fldCharType="begin"/>
+      </w:r>
+      <w:r>
+        <w:instrText xml:space="preserve"> PAGEREF GRACE_M-VSCOD \h </w:instrText>
+      </w:r>
+      <w:r>
+        <w:fldChar w:fldCharType="separate"/>
+      </w:r>
       <w:r>
         <w:rPr>
           <w:sz w:val="22"/>
+          <w:szCs w:val="22"/>
+          <w:rFonts w:ascii="Calibri" w:hAnsi="Calibri"/>
+          <w:color w:val="1F3A5F"/>
         </w:rPr>
-        <w:t>VS Code</w:t>
+        <w:t>0</w:t>
+      </w:r>
+      <w:r>
+        <w:fldChar w:fldCharType="end"/>
       </w:r>
     </w:p>
     <w:p>
       <w:pPr>
         <w:ind w:left="425"/>
-      </w:pPr>
+        <w:tabs>
+          <w:tab w:val="right" w:leader="dot" w:pos="9072"/>
+        </w:tabs>
+      </w:pPr>
+      <w:hyperlink w:anchor="GRACE_M-EDT">
+        <w:r>
+          <w:rPr>
+            <w:sz w:val="22"/>
+            <w:szCs w:val="22"/>
+            <w:rFonts w:ascii="Calibri" w:hAnsi="Calibri"/>
+            <w:color w:val="1F3A5F"/>
+            <w:u w:val="single"/>
+          </w:rPr>
+          <w:t xml:space="preserve">1С:EDT</w:t>
+        </w:r>
+      </w:hyperlink>
+      <w:r>
+        <w:tab/>
+      </w:r>
+      <w:r>
+        <w:fldChar w:fldCharType="begin"/>
+      </w:r>
+      <w:r>
+        <w:instrText xml:space="preserve"> PAGEREF GRACE_M-EDT \h </w:instrText>
+      </w:r>
+      <w:r>
+        <w:fldChar w:fldCharType="separate"/>
+      </w:r>
       <w:r>
         <w:rPr>
           <w:sz w:val="22"/>
+          <w:szCs w:val="22"/>
+          <w:rFonts w:ascii="Calibri" w:hAnsi="Calibri"/>
+          <w:color w:val="1F3A5F"/>
         </w:rPr>
-        <w:t>1С:EDT</w:t>
+        <w:t>0</w:t>
+      </w:r>
+      <w:r>
+        <w:fldChar w:fldCharType="end"/>
       </w:r>
     </w:p>
     <w:p>
       <w:pPr>
         <w:ind w:left="425"/>
-      </w:pPr>
+        <w:tabs>
+          <w:tab w:val="right" w:leader="dot" w:pos="9072"/>
+        </w:tabs>
+      </w:pPr>
+      <w:hyperlink w:anchor="GRACE_M-IDE74">
+        <w:r>
+          <w:rPr>
+            <w:sz w:val="22"/>
+            <w:szCs w:val="22"/>
+            <w:rFonts w:ascii="Calibri" w:hAnsi="Calibri"/>
+            <w:color w:val="1F3A5F"/>
+            <w:u w:val="single"/>
+          </w:rPr>
+          <w:t xml:space="preserve">IDE</w:t>
+        </w:r>
+      </w:hyperlink>
+      <w:r>
+        <w:tab/>
+      </w:r>
+      <w:r>
+        <w:fldChar w:fldCharType="begin"/>
+      </w:r>
+      <w:r>
+        <w:instrText xml:space="preserve"> PAGEREF GRACE_M-IDE74 \h </w:instrText>
+      </w:r>
+      <w:r>
+        <w:fldChar w:fldCharType="separate"/>
+      </w:r>
       <w:r>
         <w:rPr>
           <w:sz w:val="22"/>
+          <w:szCs w:val="22"/>
+          <w:rFonts w:ascii="Calibri" w:hAnsi="Calibri"/>
+          <w:color w:val="1F3A5F"/>
         </w:rPr>
-        <w:t>IDE</w:t>
+        <w:t>0</w:t>
+      </w:r>
+      <w:r>
+        <w:fldChar w:fldCharType="end"/>
       </w:r>
     </w:p>
     <w:p>
       <w:pPr>
         <w:ind w:left="0"/>
-      </w:pPr>
+        <w:tabs>
+          <w:tab w:val="right" w:leader="dot" w:pos="9072"/>
+        </w:tabs>
+      </w:pPr>
+      <w:hyperlink w:anchor="GRACE_M-DEVOPS">
+        <w:r>
+          <w:rPr>
+            <w:sz w:val="24"/>
+            <w:szCs w:val="24"/>
+            <w:rFonts w:ascii="Calibri" w:hAnsi="Calibri"/>
+            <w:b/>
+            <w:color w:val="1F3A5F"/>
+            <w:u w:val="single"/>
+          </w:rPr>
+          <w:t xml:space="preserve">DevOps</w:t>
+        </w:r>
+      </w:hyperlink>
+      <w:r>
+        <w:tab/>
+      </w:r>
+      <w:r>
+        <w:fldChar w:fldCharType="begin"/>
+      </w:r>
+      <w:r>
+        <w:instrText xml:space="preserve"> PAGEREF GRACE_M-DEVOPS \h </w:instrText>
+      </w:r>
+      <w:r>
+        <w:fldChar w:fldCharType="separate"/>
+      </w:r>
       <w:r>
         <w:rPr>
-          <w:b/>
           <w:sz w:val="24"/>
+          <w:szCs w:val="24"/>
+          <w:rFonts w:ascii="Calibri" w:hAnsi="Calibri"/>
+          <w:color w:val="1F3A5F"/>
         </w:rPr>
-        <w:t>DevOps</w:t>
+        <w:t>0</w:t>
+      </w:r>
+      <w:r>
+        <w:fldChar w:fldCharType="end"/>
       </w:r>
     </w:p>
     <w:p>
       <w:pPr>
         <w:ind w:left="425"/>
-      </w:pPr>
+        <w:tabs>
+          <w:tab w:val="right" w:leader="dot" w:pos="9072"/>
+        </w:tabs>
+      </w:pPr>
+      <w:hyperlink w:anchor="GRACE_M-DEVOPS-2">
+        <w:r>
+          <w:rPr>
+            <w:sz w:val="22"/>
+            <w:szCs w:val="22"/>
+            <w:rFonts w:ascii="Calibri" w:hAnsi="Calibri"/>
+            <w:color w:val="1F3A5F"/>
+            <w:u w:val="single"/>
+          </w:rPr>
+          <w:t xml:space="preserve">DevOps</w:t>
+        </w:r>
+      </w:hyperlink>
+      <w:r>
+        <w:tab/>
+      </w:r>
+      <w:r>
+        <w:fldChar w:fldCharType="begin"/>
+      </w:r>
+      <w:r>
+        <w:instrText xml:space="preserve"> PAGEREF GRACE_M-DEVOPS-2 \h </w:instrText>
+      </w:r>
+      <w:r>
+        <w:fldChar w:fldCharType="separate"/>
+      </w:r>
       <w:r>
         <w:rPr>
           <w:sz w:val="22"/>
+          <w:szCs w:val="22"/>
+          <w:rFonts w:ascii="Calibri" w:hAnsi="Calibri"/>
+          <w:color w:val="1F3A5F"/>
         </w:rPr>
-        <w:t>DevOps</w:t>
+        <w:t>0</w:t>
+      </w:r>
+      <w:r>
+        <w:fldChar w:fldCharType="end"/>
       </w:r>
     </w:p>
     <w:p>
       <w:pPr>
         <w:ind w:left="425"/>
-      </w:pPr>
+        <w:tabs>
+          <w:tab w:val="right" w:leader="dot" w:pos="9072"/>
+        </w:tabs>
+      </w:pPr>
+      <w:hyperlink w:anchor="GRACE_M-CODER">
+        <w:r>
+          <w:rPr>
+            <w:sz w:val="22"/>
+            <w:szCs w:val="22"/>
+            <w:rFonts w:ascii="Calibri" w:hAnsi="Calibri"/>
+            <w:color w:val="1F3A5F"/>
+            <w:u w:val="single"/>
+          </w:rPr>
+          <w:t xml:space="preserve">code-review</w:t>
+        </w:r>
+      </w:hyperlink>
+      <w:r>
+        <w:tab/>
+      </w:r>
+      <w:r>
+        <w:fldChar w:fldCharType="begin"/>
+      </w:r>
+      <w:r>
+        <w:instrText xml:space="preserve"> PAGEREF GRACE_M-CODER \h </w:instrText>
+      </w:r>
+      <w:r>
+        <w:fldChar w:fldCharType="separate"/>
+      </w:r>
       <w:r>
         <w:rPr>
           <w:sz w:val="22"/>
+          <w:szCs w:val="22"/>
+          <w:rFonts w:ascii="Calibri" w:hAnsi="Calibri"/>
+          <w:color w:val="1F3A5F"/>
         </w:rPr>
-        <w:t>code-review</w:t>
+        <w:t>0</w:t>
+      </w:r>
+      <w:r>
+        <w:fldChar w:fldCharType="end"/>
       </w:r>
     </w:p>
     <w:p>
       <w:pPr>
         <w:ind w:left="850"/>
-      </w:pPr>
+        <w:tabs>
+          <w:tab w:val="right" w:leader="dot" w:pos="9072"/>
+        </w:tabs>
+      </w:pPr>
+      <w:hyperlink w:anchor="GRACE_M-CR">
+        <w:r>
+          <w:rPr>
+            <w:sz w:val="22"/>
+            <w:szCs w:val="22"/>
+            <w:rFonts w:ascii="Calibri" w:hAnsi="Calibri"/>
+            <w:color w:val="1F3A5F"/>
+            <w:u w:val="single"/>
+          </w:rPr>
+          <w:t xml:space="preserve">Code-review</w:t>
+        </w:r>
+      </w:hyperlink>
+      <w:r>
+        <w:tab/>
+      </w:r>
+      <w:r>
+        <w:fldChar w:fldCharType="begin"/>
+      </w:r>
+      <w:r>
+        <w:instrText xml:space="preserve"> PAGEREF GRACE_M-CR \h </w:instrText>
+      </w:r>
+      <w:r>
+        <w:fldChar w:fldCharType="separate"/>
+      </w:r>
       <w:r>
         <w:rPr>
           <w:sz w:val="22"/>
+          <w:szCs w:val="22"/>
+          <w:rFonts w:ascii="Calibri" w:hAnsi="Calibri"/>
+          <w:color w:val="1F3A5F"/>
         </w:rPr>
-        <w:t>Code-review</w:t>
+        <w:t>0</w:t>
+      </w:r>
+      <w:r>
+        <w:fldChar w:fldCharType="end"/>
       </w:r>
     </w:p>
     <w:p>
       <w:pPr>
         <w:ind w:left="425"/>
-      </w:pPr>
+        <w:tabs>
+          <w:tab w:val="right" w:leader="dot" w:pos="9072"/>
+        </w:tabs>
+      </w:pPr>
+      <w:hyperlink w:anchor="GRACE_M-DELIV">
+        <w:r>
+          <w:rPr>
+            <w:sz w:val="22"/>
+            <w:szCs w:val="22"/>
+            <w:rFonts w:ascii="Calibri" w:hAnsi="Calibri"/>
+            <w:color w:val="1F3A5F"/>
+            <w:u w:val="single"/>
+          </w:rPr>
+          <w:t xml:space="preserve">delivery</w:t>
+        </w:r>
+      </w:hyperlink>
+      <w:r>
+        <w:tab/>
+      </w:r>
+      <w:r>
+        <w:fldChar w:fldCharType="begin"/>
+      </w:r>
+      <w:r>
+        <w:instrText xml:space="preserve"> PAGEREF GRACE_M-DELIV \h </w:instrText>
+      </w:r>
+      <w:r>
+        <w:fldChar w:fldCharType="separate"/>
+      </w:r>
       <w:r>
         <w:rPr>
           <w:sz w:val="22"/>
+          <w:szCs w:val="22"/>
+          <w:rFonts w:ascii="Calibri" w:hAnsi="Calibri"/>
+          <w:color w:val="1F3A5F"/>
         </w:rPr>
-        <w:t>delivery</w:t>
+        <w:t>0</w:t>
+      </w:r>
+      <w:r>
+        <w:fldChar w:fldCharType="end"/>
       </w:r>
     </w:p>
     <w:p>
       <w:pPr>
         <w:ind w:left="850"/>
-      </w:pPr>
+        <w:tabs>
+          <w:tab w:val="right" w:leader="dot" w:pos="9072"/>
+        </w:tabs>
+      </w:pPr>
+      <w:hyperlink w:anchor="GRACE_M-DELIVER">
+        <w:r>
+          <w:rPr>
+            <w:sz w:val="22"/>
+            <w:szCs w:val="22"/>
+            <w:rFonts w:ascii="Calibri" w:hAnsi="Calibri"/>
+            <w:color w:val="1F3A5F"/>
+            <w:u w:val="single"/>
+          </w:rPr>
+          <w:t xml:space="preserve">Доставка и развертывание</w:t>
+        </w:r>
+      </w:hyperlink>
+      <w:r>
+        <w:tab/>
+      </w:r>
+      <w:r>
+        <w:fldChar w:fldCharType="begin"/>
+      </w:r>
+      <w:r>
+        <w:instrText xml:space="preserve"> PAGEREF GRACE_M-DELIVER \h </w:instrText>
+      </w:r>
+      <w:r>
+        <w:fldChar w:fldCharType="separate"/>
+      </w:r>
       <w:r>
         <w:rPr>
           <w:sz w:val="22"/>
+          <w:szCs w:val="22"/>
+          <w:rFonts w:ascii="Calibri" w:hAnsi="Calibri"/>
+          <w:color w:val="1F3A5F"/>
         </w:rPr>
-        <w:t>Доставка и развертывание</w:t>
+        <w:t>0</w:t>
+      </w:r>
+      <w:r>
+        <w:fldChar w:fldCharType="end"/>
       </w:r>
     </w:p>
     <w:p>
       <w:pPr>
         <w:ind w:left="425"/>
-      </w:pPr>
+        <w:tabs>
+          <w:tab w:val="right" w:leader="dot" w:pos="9072"/>
+        </w:tabs>
+      </w:pPr>
+      <w:hyperlink w:anchor="GRACE_M-PIPEL">
+        <w:r>
+          <w:rPr>
+            <w:sz w:val="22"/>
+            <w:szCs w:val="22"/>
+            <w:rFonts w:ascii="Calibri" w:hAnsi="Calibri"/>
+            <w:color w:val="1F3A5F"/>
+            <w:u w:val="single"/>
+          </w:rPr>
+          <w:t xml:space="preserve">pipelines</w:t>
+        </w:r>
+      </w:hyperlink>
+      <w:r>
+        <w:tab/>
+      </w:r>
+      <w:r>
+        <w:fldChar w:fldCharType="begin"/>
+      </w:r>
+      <w:r>
+        <w:instrText xml:space="preserve"> PAGEREF GRACE_M-PIPEL \h </w:instrText>
+      </w:r>
+      <w:r>
+        <w:fldChar w:fldCharType="separate"/>
+      </w:r>
       <w:r>
         <w:rPr>
           <w:sz w:val="22"/>
+          <w:szCs w:val="22"/>
+          <w:rFonts w:ascii="Calibri" w:hAnsi="Calibri"/>
+          <w:color w:val="1F3A5F"/>
         </w:rPr>
-        <w:t>pipelines</w:t>
+        <w:t>0</w:t>
+      </w:r>
+      <w:r>
+        <w:fldChar w:fldCharType="end"/>
       </w:r>
     </w:p>
     <w:p>
       <w:pPr>
         <w:ind w:left="850"/>
-      </w:pPr>
+        <w:tabs>
+          <w:tab w:val="right" w:leader="dot" w:pos="9072"/>
+        </w:tabs>
+      </w:pPr>
+      <w:hyperlink w:anchor="GRACE_M-JENKI">
+        <w:r>
+          <w:rPr>
+            <w:sz w:val="22"/>
+            <w:szCs w:val="22"/>
+            <w:rFonts w:ascii="Calibri" w:hAnsi="Calibri"/>
+            <w:color w:val="1F3A5F"/>
+            <w:u w:val="single"/>
+          </w:rPr>
+          <w:t xml:space="preserve">Профиль реализации Jenkins</w:t>
+        </w:r>
+      </w:hyperlink>
+      <w:r>
+        <w:tab/>
+      </w:r>
+      <w:r>
+        <w:fldChar w:fldCharType="begin"/>
+      </w:r>
+      <w:r>
+        <w:instrText xml:space="preserve"> PAGEREF GRACE_M-JENKI \h </w:instrText>
+      </w:r>
+      <w:r>
+        <w:fldChar w:fldCharType="separate"/>
+      </w:r>
       <w:r>
         <w:rPr>
           <w:sz w:val="22"/>
+          <w:szCs w:val="22"/>
+          <w:rFonts w:ascii="Calibri" w:hAnsi="Calibri"/>
+          <w:color w:val="1F3A5F"/>
         </w:rPr>
-        <w:t>Профиль реализации Jenkins</w:t>
+        <w:t>0</w:t>
+      </w:r>
+      <w:r>
+        <w:fldChar w:fldCharType="end"/>
       </w:r>
     </w:p>
     <w:p>
       <w:pPr>
         <w:ind w:left="850"/>
-      </w:pPr>
+        <w:tabs>
+          <w:tab w:val="right" w:leader="dot" w:pos="9072"/>
+        </w:tabs>
+      </w:pPr>
+      <w:hyperlink w:anchor="GRACE_M-PIPE">
+        <w:r>
+          <w:rPr>
+            <w:sz w:val="22"/>
+            <w:szCs w:val="22"/>
+            <w:rFonts w:ascii="Calibri" w:hAnsi="Calibri"/>
+            <w:color w:val="1F3A5F"/>
+            <w:u w:val="single"/>
+          </w:rPr>
+          <w:t xml:space="preserve">Конвейеры CI/CD</w:t>
+        </w:r>
+      </w:hyperlink>
+      <w:r>
+        <w:tab/>
+      </w:r>
+      <w:r>
+        <w:fldChar w:fldCharType="begin"/>
+      </w:r>
+      <w:r>
+        <w:instrText xml:space="preserve"> PAGEREF GRACE_M-PIPE \h </w:instrText>
+      </w:r>
+      <w:r>
+        <w:fldChar w:fldCharType="separate"/>
+      </w:r>
       <w:r>
         <w:rPr>
           <w:sz w:val="22"/>
+          <w:szCs w:val="22"/>
+          <w:rFonts w:ascii="Calibri" w:hAnsi="Calibri"/>
+          <w:color w:val="1F3A5F"/>
         </w:rPr>
-        <w:t>Конвейеры CI/CD</w:t>
+        <w:t>0</w:t>
+      </w:r>
+      <w:r>
+        <w:fldChar w:fldCharType="end"/>
       </w:r>
     </w:p>
     <w:p>
       <w:pPr>
         <w:ind w:left="850"/>
-      </w:pPr>
+        <w:tabs>
+          <w:tab w:val="right" w:leader="dot" w:pos="9072"/>
+        </w:tabs>
+      </w:pPr>
+      <w:hyperlink w:anchor="GRACE_M-GITLA">
+        <w:r>
+          <w:rPr>
+            <w:sz w:val="22"/>
+            <w:szCs w:val="22"/>
+            <w:rFonts w:ascii="Calibri" w:hAnsi="Calibri"/>
+            <w:color w:val="1F3A5F"/>
+            <w:u w:val="single"/>
+          </w:rPr>
+          <w:t xml:space="preserve">Профиль реализации GitLab CI</w:t>
+        </w:r>
+      </w:hyperlink>
+      <w:r>
+        <w:tab/>
+      </w:r>
+      <w:r>
+        <w:fldChar w:fldCharType="begin"/>
+      </w:r>
+      <w:r>
+        <w:instrText xml:space="preserve"> PAGEREF GRACE_M-GITLA \h </w:instrText>
+      </w:r>
+      <w:r>
+        <w:fldChar w:fldCharType="separate"/>
+      </w:r>
       <w:r>
         <w:rPr>
           <w:sz w:val="22"/>
+          <w:szCs w:val="22"/>
+          <w:rFonts w:ascii="Calibri" w:hAnsi="Calibri"/>
+          <w:color w:val="1F3A5F"/>
         </w:rPr>
-        <w:t>Профиль реализации GitLab CI</w:t>
+        <w:t>0</w:t>
+      </w:r>
+      <w:r>
+        <w:fldChar w:fldCharType="end"/>
       </w:r>
     </w:p>
     <w:p>
       <w:pPr>
         <w:ind w:left="425"/>
-      </w:pPr>
+        <w:tabs>
+          <w:tab w:val="right" w:leader="dot" w:pos="9072"/>
+        </w:tabs>
+      </w:pPr>
+      <w:hyperlink w:anchor="GRACE_M-SONAR">
+        <w:r>
+          <w:rPr>
+            <w:sz w:val="22"/>
+            <w:szCs w:val="22"/>
+            <w:rFonts w:ascii="Calibri" w:hAnsi="Calibri"/>
+            <w:color w:val="1F3A5F"/>
+            <w:u w:val="single"/>
+          </w:rPr>
+          <w:t xml:space="preserve">sonar</w:t>
+        </w:r>
+      </w:hyperlink>
+      <w:r>
+        <w:tab/>
+      </w:r>
+      <w:r>
+        <w:fldChar w:fldCharType="begin"/>
+      </w:r>
+      <w:r>
+        <w:instrText xml:space="preserve"> PAGEREF GRACE_M-SONAR \h </w:instrText>
+      </w:r>
+      <w:r>
+        <w:fldChar w:fldCharType="separate"/>
+      </w:r>
       <w:r>
         <w:rPr>
           <w:sz w:val="22"/>
+          <w:szCs w:val="22"/>
+          <w:rFonts w:ascii="Calibri" w:hAnsi="Calibri"/>
+          <w:color w:val="1F3A5F"/>
         </w:rPr>
-        <w:t>sonar</w:t>
+        <w:t>0</w:t>
+      </w:r>
+      <w:r>
+        <w:fldChar w:fldCharType="end"/>
       </w:r>
     </w:p>
     <w:p>
       <w:pPr>
         <w:ind w:left="850"/>
-      </w:pPr>
+        <w:tabs>
+          <w:tab w:val="right" w:leader="dot" w:pos="9072"/>
+        </w:tabs>
+      </w:pPr>
+      <w:hyperlink w:anchor="GRACE_M-SONAR-2">
+        <w:r>
+          <w:rPr>
+            <w:sz w:val="22"/>
+            <w:szCs w:val="22"/>
+            <w:rFonts w:ascii="Calibri" w:hAnsi="Calibri"/>
+            <w:color w:val="1F3A5F"/>
+            <w:u w:val="single"/>
+          </w:rPr>
+          <w:t xml:space="preserve">SonarQube</w:t>
+        </w:r>
+      </w:hyperlink>
+      <w:r>
+        <w:tab/>
+      </w:r>
+      <w:r>
+        <w:fldChar w:fldCharType="begin"/>
+      </w:r>
+      <w:r>
+        <w:instrText xml:space="preserve"> PAGEREF GRACE_M-SONAR-2 \h </w:instrText>
+      </w:r>
+      <w:r>
+        <w:fldChar w:fldCharType="separate"/>
+      </w:r>
       <w:r>
         <w:rPr>
           <w:sz w:val="22"/>
+          <w:szCs w:val="22"/>
+          <w:rFonts w:ascii="Calibri" w:hAnsi="Calibri"/>
+          <w:color w:val="1F3A5F"/>
         </w:rPr>
-        <w:t>SonarQube</w:t>
+        <w:t>0</w:t>
+      </w:r>
+      <w:r>
+        <w:fldChar w:fldCharType="end"/>
       </w:r>
     </w:p>
     <w:p>
       <w:pPr>
         <w:ind w:left="425"/>
-      </w:pPr>
+        <w:tabs>
+          <w:tab w:val="right" w:leader="dot" w:pos="9072"/>
+        </w:tabs>
+      </w:pPr>
+      <w:hyperlink w:anchor="GRACE_M-TESTI">
+        <w:r>
+          <w:rPr>
+            <w:sz w:val="22"/>
+            <w:szCs w:val="22"/>
+            <w:rFonts w:ascii="Calibri" w:hAnsi="Calibri"/>
+            <w:color w:val="1F3A5F"/>
+            <w:u w:val="single"/>
+          </w:rPr>
+          <w:t xml:space="preserve">testing</w:t>
+        </w:r>
+      </w:hyperlink>
+      <w:r>
+        <w:tab/>
+      </w:r>
+      <w:r>
+        <w:fldChar w:fldCharType="begin"/>
+      </w:r>
+      <w:r>
+        <w:instrText xml:space="preserve"> PAGEREF GRACE_M-TESTI \h </w:instrText>
+      </w:r>
+      <w:r>
+        <w:fldChar w:fldCharType="separate"/>
+      </w:r>
       <w:r>
         <w:rPr>
           <w:sz w:val="22"/>
+          <w:szCs w:val="22"/>
+          <w:rFonts w:ascii="Calibri" w:hAnsi="Calibri"/>
+          <w:color w:val="1F3A5F"/>
         </w:rPr>
-        <w:t>testing</w:t>
+        <w:t>0</w:t>
+      </w:r>
+      <w:r>
+        <w:fldChar w:fldCharType="end"/>
       </w:r>
     </w:p>
     <w:p>
       <w:pPr>
         <w:ind w:left="850"/>
-      </w:pPr>
+        <w:tabs>
+          <w:tab w:val="right" w:leader="dot" w:pos="9072"/>
+        </w:tabs>
+      </w:pPr>
+      <w:hyperlink w:anchor="GRACE_M-SEC188">
+        <w:r>
+          <w:rPr>
+            <w:sz w:val="22"/>
+            <w:szCs w:val="22"/>
+            <w:rFonts w:ascii="Calibri" w:hAnsi="Calibri"/>
+            <w:color w:val="1F3A5F"/>
+            <w:u w:val="single"/>
+          </w:rPr>
+          <w:t xml:space="preserve">Стратегия автоматизированного тестирования</w:t>
+        </w:r>
+      </w:hyperlink>
+      <w:r>
+        <w:tab/>
+      </w:r>
+      <w:r>
+        <w:fldChar w:fldCharType="begin"/>
+      </w:r>
+      <w:r>
+        <w:instrText xml:space="preserve"> PAGEREF GRACE_M-SEC188 \h </w:instrText>
+      </w:r>
+      <w:r>
+        <w:fldChar w:fldCharType="separate"/>
+      </w:r>
       <w:r>
         <w:rPr>
           <w:sz w:val="22"/>
+          <w:szCs w:val="22"/>
+          <w:rFonts w:ascii="Calibri" w:hAnsi="Calibri"/>
+          <w:color w:val="1F3A5F"/>
         </w:rPr>
-        <w:t>Стратегия автоматизированного тестирования</w:t>
+        <w:t>0</w:t>
+      </w:r>
+      <w:r>
+        <w:fldChar w:fldCharType="end"/>
       </w:r>
     </w:p>
     <w:p>
       <w:pPr>
         <w:ind w:left="850"/>
-      </w:pPr>
+        <w:tabs>
+          <w:tab w:val="right" w:leader="dot" w:pos="9072"/>
+        </w:tabs>
+      </w:pPr>
+      <w:hyperlink w:anchor="GRACE_M-TESTDATA">
+        <w:r>
+          <w:rPr>
+            <w:sz w:val="22"/>
+            <w:szCs w:val="22"/>
+            <w:rFonts w:ascii="Calibri" w:hAnsi="Calibri"/>
+            <w:color w:val="1F3A5F"/>
+            <w:u w:val="single"/>
+          </w:rPr>
+          <w:t xml:space="preserve">Инициализация тестовой ИБ</w:t>
+        </w:r>
+      </w:hyperlink>
+      <w:r>
+        <w:tab/>
+      </w:r>
+      <w:r>
+        <w:fldChar w:fldCharType="begin"/>
+      </w:r>
+      <w:r>
+        <w:instrText xml:space="preserve"> PAGEREF GRACE_M-TESTDATA \h </w:instrText>
+      </w:r>
+      <w:r>
+        <w:fldChar w:fldCharType="separate"/>
+      </w:r>
       <w:r>
         <w:rPr>
           <w:sz w:val="22"/>
+          <w:szCs w:val="22"/>
+          <w:rFonts w:ascii="Calibri" w:hAnsi="Calibri"/>
+          <w:color w:val="1F3A5F"/>
         </w:rPr>
-        <w:t>Инициализация тестовой ИБ</w:t>
+        <w:t>0</w:t>
+      </w:r>
+      <w:r>
+        <w:fldChar w:fldCharType="end"/>
       </w:r>
     </w:p>
     <w:p>
       <w:pPr>
         <w:ind w:left="850"/>
-      </w:pPr>
+        <w:tabs>
+          <w:tab w:val="right" w:leader="dot" w:pos="9072"/>
+        </w:tabs>
+      </w:pPr>
+      <w:hyperlink w:anchor="GRACE_M-HRMCHK">
+        <w:r>
+          <w:rPr>
+            <w:sz w:val="22"/>
+            <w:szCs w:val="22"/>
+            <w:rFonts w:ascii="Calibri" w:hAnsi="Calibri"/>
+            <w:color w:val="1F3A5F"/>
+            <w:u w:val="single"/>
+          </w:rPr>
+          <w:t xml:space="preserve">Чек-лист ЗУП</w:t>
+        </w:r>
+      </w:hyperlink>
+      <w:r>
+        <w:tab/>
+      </w:r>
+      <w:r>
+        <w:fldChar w:fldCharType="begin"/>
+      </w:r>
+      <w:r>
+        <w:instrText xml:space="preserve"> PAGEREF GRACE_M-HRMCHK \h </w:instrText>
+      </w:r>
+      <w:r>
+        <w:fldChar w:fldCharType="separate"/>
+      </w:r>
       <w:r>
         <w:rPr>
           <w:sz w:val="22"/>
+          <w:szCs w:val="22"/>
+          <w:rFonts w:ascii="Calibri" w:hAnsi="Calibri"/>
+          <w:color w:val="1F3A5F"/>
         </w:rPr>
-        <w:t>Чек-лист ЗУП</w:t>
+        <w:t>0</w:t>
+      </w:r>
+      <w:r>
+        <w:fldChar w:fldCharType="end"/>
       </w:r>
     </w:p>
     <w:p>
       <w:pPr>
         <w:ind w:left="850"/>
-      </w:pPr>
+        <w:tabs>
+          <w:tab w:val="right" w:leader="dot" w:pos="9072"/>
+        </w:tabs>
+      </w:pPr>
+      <w:hyperlink w:anchor="GRACE_M-TEST">
+        <w:r>
+          <w:rPr>
+            <w:sz w:val="22"/>
+            <w:szCs w:val="22"/>
+            <w:rFonts w:ascii="Calibri" w:hAnsi="Calibri"/>
+            <w:color w:val="1F3A5F"/>
+            <w:u w:val="single"/>
+          </w:rPr>
+          <w:t xml:space="preserve">Тестирование</w:t>
+        </w:r>
+      </w:hyperlink>
+      <w:r>
+        <w:tab/>
+      </w:r>
+      <w:r>
+        <w:fldChar w:fldCharType="begin"/>
+      </w:r>
+      <w:r>
+        <w:instrText xml:space="preserve"> PAGEREF GRACE_M-TEST \h </w:instrText>
+      </w:r>
+      <w:r>
+        <w:fldChar w:fldCharType="separate"/>
+      </w:r>
       <w:r>
         <w:rPr>
           <w:sz w:val="22"/>
+          <w:szCs w:val="22"/>
+          <w:rFonts w:ascii="Calibri" w:hAnsi="Calibri"/>
+          <w:color w:val="1F3A5F"/>
         </w:rPr>
-        <w:t>Тестирование</w:t>
+        <w:t>0</w:t>
+      </w:r>
+      <w:r>
+        <w:fldChar w:fldCharType="end"/>
       </w:r>
     </w:p>
     <w:p>
@@ -1851,7 +4557,7 @@
     </w:p>
     <w:bookmarkEnd w:id="102"/>
     <w:p>
-      <w:bookmarkStart w:id="103" w:name="GRACE_M-SEC110"/>
+      <w:bookmarkStart w:id="103" w:name="GRACE_M-SEC113"/>
       <w:pPr>
         <w:pStyle w:val="Heading1"/>
       </w:pPr>
@@ -7566,7 +10272,7 @@
     </w:p>
     <w:bookmarkEnd w:id="120"/>
     <w:p>
-      <w:bookmarkStart w:id="121" w:name="GRACE_M-SEC128"/>
+      <w:bookmarkStart w:id="121" w:name="GRACE_M-SEC131"/>
       <w:pPr>
         <w:pStyle w:val="Heading1"/>
       </w:pPr>
@@ -12113,7 +14819,7 @@
     </w:p>
     <w:bookmarkEnd w:id="126"/>
     <w:p>
-      <w:bookmarkStart w:id="127" w:name="GRACE_M-GIT34"/>
+      <w:bookmarkStart w:id="127" w:name="GRACE_M-GIT37"/>
       <w:pPr>
         <w:pStyle w:val="Heading3"/>
       </w:pPr>
@@ -12370,7 +15076,7 @@
     </w:p>
     <w:bookmarkEnd w:id="127"/>
     <w:p>
-      <w:bookmarkStart w:id="128" w:name="GRACE_M-SEC135"/>
+      <w:bookmarkStart w:id="128" w:name="GRACE_M-SEC138"/>
       <w:pPr>
         <w:pStyle w:val="Heading3"/>
       </w:pPr>
@@ -14073,7 +16779,7 @@
     </w:p>
     <w:bookmarkEnd w:id="129"/>
     <w:p>
-      <w:bookmarkStart w:id="130" w:name="GRACE_M-GIT37"/>
+      <w:bookmarkStart w:id="130" w:name="GRACE_M-GIT40"/>
       <w:pPr>
         <w:pStyle w:val="Heading3"/>
       </w:pPr>
@@ -14504,7 +17210,7 @@
     </w:p>
     <w:bookmarkEnd w:id="130"/>
     <w:p>
-      <w:bookmarkStart w:id="131" w:name="GRACE_M-GIT38"/>
+      <w:bookmarkStart w:id="131" w:name="GRACE_M-GIT41"/>
       <w:pPr>
         <w:pStyle w:val="Heading3"/>
       </w:pPr>
@@ -16817,7 +19523,7 @@
     </w:p>
     <w:bookmarkEnd w:id="134"/>
     <w:p>
-      <w:bookmarkStart w:id="135" w:name="GRACE_M-SEC142"/>
+      <w:bookmarkStart w:id="135" w:name="GRACE_M-SEC145"/>
       <w:pPr>
         <w:pStyle w:val="Heading1"/>
       </w:pPr>
@@ -18101,7 +20807,7 @@
     </w:p>
     <w:bookmarkEnd w:id="139"/>
     <w:p>
-      <w:bookmarkStart w:id="140" w:name="GRACE_M-SEC147"/>
+      <w:bookmarkStart w:id="140" w:name="GRACE_M-SEC150"/>
       <w:pPr>
         <w:pStyle w:val="Heading2"/>
       </w:pPr>
@@ -20008,7 +22714,7 @@
     </w:p>
     <w:bookmarkEnd w:id="140"/>
     <w:p>
-      <w:bookmarkStart w:id="141" w:name="GRACE_M-SEC148"/>
+      <w:bookmarkStart w:id="141" w:name="GRACE_M-SEC151"/>
       <w:pPr>
         <w:pStyle w:val="Heading2"/>
       </w:pPr>
@@ -24664,7 +27370,7 @@
     </w:p>
     <w:bookmarkEnd w:id="153"/>
     <w:p>
-      <w:bookmarkStart w:id="154" w:name="GRACE_M-SEC161"/>
+      <w:bookmarkStart w:id="154" w:name="GRACE_M-SEC164"/>
       <w:pPr>
         <w:pStyle w:val="Heading1"/>
       </w:pPr>
@@ -25507,7 +28213,7 @@
     </w:p>
     <w:bookmarkEnd w:id="157"/>
     <w:p>
-      <w:bookmarkStart w:id="158" w:name="GRACE_M-SEC165"/>
+      <w:bookmarkStart w:id="158" w:name="GRACE_M-SEC168"/>
       <w:pPr>
         <w:pStyle w:val="Heading2"/>
       </w:pPr>
@@ -28384,7 +31090,7 @@
     </w:p>
     <w:bookmarkEnd w:id="163"/>
     <w:p>
-      <w:bookmarkStart w:id="164" w:name="GRACE_M-IDE71"/>
+      <w:bookmarkStart w:id="164" w:name="GRACE_M-IDE74"/>
       <w:pPr>
         <w:pStyle w:val="Heading2"/>
       </w:pPr>
@@ -31539,7 +34245,7 @@
     </w:p>
     <w:bookmarkEnd w:id="177"/>
     <w:p>
-      <w:bookmarkStart w:id="178" w:name="GRACE_M-SEC185"/>
+      <w:bookmarkStart w:id="178" w:name="GRACE_M-SEC188"/>
       <w:pPr>
         <w:pStyle w:val="Heading3"/>
       </w:pPr>
@@ -32623,7 +35329,7 @@
         <item>Change heading styles or structure</item>
       </cannot-edit>
     </C-M-PREFIX>
-    <C-M-SEC110 inherits="C-NARRATIVE">
+    <C-M-SEC113 inherits="C-NARRATIVE">
       <description>Оформление — NARRATIVE-type section</description>
       <can-edit>
         <item>Add paragraphs after existing content, modify text runs</item>
@@ -32631,7 +35337,7 @@
       <cannot-edit>
         <item>Change heading styles or structure</item>
       </cannot-edit>
-    </C-M-SEC110>
+    </C-M-SEC113>
     <C-M-META inherits="C-NARRATIVE">
       <description>Метаданные — NAVIGATION-type section</description>
       <can-edit>
@@ -32785,7 +35491,7 @@
         <item>Change heading styles or structure</item>
       </cannot-edit>
     </C-M-EXT>
-    <C-M-SEC128 inherits="C-NARRATIVE">
+    <C-M-SEC131 inherits="C-NARRATIVE">
       <description>Глоссарий — NARRATIVE-type section</description>
       <can-edit>
         <item>Add paragraphs after existing content, modify text runs</item>
@@ -32793,7 +35499,7 @@
       <cannot-edit>
         <item>Change heading styles or structure</item>
       </cannot-edit>
-    </C-M-SEC128>
+    </C-M-SEC131>
     <C-M-VC inherits="C-MIXED">
       <description>Система управления версиями — MIXED-type section</description>
       <can-edit>
@@ -32839,7 +35545,7 @@
         <item>Change heading styles or structure</item>
       </cannot-edit>
     </C-M-GIT>
-    <C-M-GIT34 inherits="C-NARRATIVE">
+    <C-M-GIT37 inherits="C-NARRATIVE">
       <description>Git — NARRATIVE-type section</description>
       <can-edit>
         <item>Add paragraphs after existing content, modify text runs</item>
@@ -32847,8 +35553,8 @@
       <cannot-edit>
         <item>Change heading styles or structure</item>
       </cannot-edit>
-    </C-M-GIT34>
-    <C-M-SEC135 inherits="C-MIXED">
+    </C-M-GIT37>
+    <C-M-SEC138 inherits="C-MIXED">
       <description>Команды — MIXED-type section</description>
       <can-edit>
         <item>Add paragraphs after existing content, modify text runs</item>
@@ -32856,7 +35562,7 @@
       <cannot-edit>
         <item>Change heading styles or structure</item>
       </cannot-edit>
-    </C-M-SEC135>
+    </C-M-SEC138>
     <C-M-SSH inherits="C-MIXED">
       <description>SSH — MIXED-type section</description>
       <can-edit>
@@ -32866,7 +35572,7 @@
         <item>Change heading styles or structure</item>
       </cannot-edit>
     </C-M-SSH>
-    <C-M-GIT37 inherits="C-MIXED">
+    <C-M-GIT40 inherits="C-MIXED">
       <description>Исключения Git — MIXED-type section</description>
       <can-edit>
         <item>Add paragraphs after existing content, modify text runs</item>
@@ -32874,8 +35580,8 @@
       <cannot-edit>
         <item>Change heading styles or structure</item>
       </cannot-edit>
-    </C-M-GIT37>
-    <C-M-GIT38 inherits="C-MIXED">
+    </C-M-GIT40>
+    <C-M-GIT41 inherits="C-MIXED">
       <description>Атрибуты Git — MIXED-type section</description>
       <can-edit>
         <item>Add paragraphs after existing content, modify text runs</item>
@@ -32883,7 +35589,7 @@
       <cannot-edit>
         <item>Change heading styles or structure</item>
       </cannot-edit>
-    </C-M-GIT38>
+    </C-M-GIT41>
     <C-M-LFS inherits="C-MIXED">
       <description>Git LFS — MIXED-type section</description>
       <can-edit>
@@ -32911,7 +35617,7 @@
         <item>Change heading styles or structure</item>
       </cannot-edit>
     </C-M-GITFLOW>
-    <C-M-SEC142 inherits="C-NARRATIVE">
+    <C-M-SEC145 inherits="C-NARRATIVE">
       <description>Принципы разработки — NARRATIVE-type section</description>
       <can-edit>
         <item>Add paragraphs after existing content, modify text runs</item>
@@ -32919,7 +35625,7 @@
       <cannot-edit>
         <item>Change heading styles or structure</item>
       </cannot-edit>
-    </C-M-SEC142>
+    </C-M-SEC145>
     <C-M-KISS inherits="C-NARRATIVE">
       <description>KISS — NARRATIVE-type section</description>
       <can-edit>
@@ -32956,7 +35662,7 @@
         <item>Change heading styles or structure</item>
       </cannot-edit>
     </C-M-SOLID>
-    <C-M-SEC147 inherits="C-NARRATIVE">
+    <C-M-SEC150 inherits="C-NARRATIVE">
       <description>Архитектура — NARRATIVE-type section</description>
       <can-edit>
         <item>Add paragraphs after existing content, modify text runs</item>
@@ -32964,8 +35670,8 @@
       <cannot-edit>
         <item>Change heading styles or structure</item>
       </cannot-edit>
-    </C-M-SEC147>
-    <C-M-SEC148 inherits="C-NARRATIVE">
+    </C-M-SEC150>
+    <C-M-SEC151 inherits="C-NARRATIVE">
       <description>Принципы разработки — NARRATIVE-type section</description>
       <can-edit>
         <item>Add paragraphs after existing content, modify text runs</item>
@@ -32973,7 +35679,7 @@
       <cannot-edit>
         <item>Change heading styles or structure</item>
       </cannot-edit>
-    </C-M-SEC148>
+    </C-M-SEC151>
     <C-M-INTEG inherits="C-NARRATIVE">
       <description>Интеграции — NARRATIVE-type section</description>
       <can-edit>
@@ -33082,7 +35788,7 @@
         <item>Change heading styles or structure</item>
       </cannot-edit>
     </C-M-KAFKA-2>
-    <C-M-SEC161 inherits="C-NARRATIVE">
+    <C-M-SEC164 inherits="C-NARRATIVE">
       <description>Руководства — NARRATIVE-type section</description>
       <can-edit>
         <item>Add paragraphs after existing content, modify text runs</item>
@@ -33090,7 +35796,7 @@
       <cannot-edit>
         <item>Change heading styles or structure</item>
       </cannot-edit>
-    </C-M-SEC161>
+    </C-M-SEC164>
     <C-M-ENV inherits="C-NARRATIVE">
       <description>Окружения — NARRATIVE-type section</description>
       <can-edit>
@@ -33118,7 +35824,7 @@
         <item>Change heading styles or structure</item>
       </cannot-edit>
     </C-M-TASK>
-    <C-M-SEC165 inherits="C-NARRATIVE">
+    <C-M-SEC168 inherits="C-NARRATIVE">
       <description>Руководства — NARRATIVE-type section</description>
       <can-edit>
         <item>Add paragraphs after existing content, modify text runs</item>
@@ -33126,7 +35832,7 @@
       <cannot-edit>
         <item>Change heading styles or structure</item>
       </cannot-edit>
-    </C-M-SEC165>
+    </C-M-SEC168>
     <C-M-USERS inherits="C-NARRATIVE">
       <description>users — NARRATIVE-type section</description>
       <can-edit>
@@ -33172,7 +35878,7 @@
         <item>Change heading styles or structure</item>
       </cannot-edit>
     </C-M-EDT>
-    <C-M-IDE71 inherits="C-TABLE-DATA">
+    <C-M-IDE74 inherits="C-TABLE-DATA">
       <description>IDE — DATA-type section</description>
       <can-edit>
         <item>Add paragraphs after existing content, modify text runs</item>
@@ -33180,7 +35886,7 @@
       <cannot-edit>
         <item>Change heading styles or structure</item>
       </cannot-edit>
-    </C-M-IDE71>
+    </C-M-IDE74>
     <C-M-DEVOPS inherits="C-NARRATIVE">
       <description>DevOps — NARRATIVE-type section</description>
       <can-edit>
@@ -33298,7 +36004,7 @@
         <item>Change heading styles or structure</item>
       </cannot-edit>
     </C-M-TESTI>
-    <C-M-SEC185 inherits="C-NARRATIVE">
+    <C-M-SEC188 inherits="C-NARRATIVE">
       <description>Стратегия автоматизированного тестирования — NARRATIVE-type section</description>
       <can-edit>
         <item>Add paragraphs after existing content, modify text runs</item>
@@ -33306,7 +36012,7 @@
       <cannot-edit>
         <item>Change heading styles or structure</item>
       </cannot-edit>
-    </C-M-SEC185>
+    </C-M-SEC188>
     <C-M-TESTDATA inherits="C-NARRATIVE">
       <description>Инициализация тестовой ИБ — NARRATIVE-type section</description>
       <can-edit>
@@ -33369,13 +36075,13 @@
       <PARA-START>77</PARA-START>
       <PARA-END>91</PARA-END>
     </M-PREFIX>
-    <M-SEC110>
+    <M-SEC113>
       <n>Оформление</n>
       <TYPE>NARRATIVE</TYPE>
-      <BOOKMARK>GRACE_M-SEC110</BOOKMARK>
+      <BOOKMARK>GRACE_M-SEC113</BOOKMARK>
       <PARA-START>92</PARA-START>
       <PARA-END>213</PARA-END>
-    </M-SEC110>
+    </M-SEC113>
     <M-META>
       <n>Метаданные</n>
       <TYPE>NAVIGATION</TYPE>
@@ -33495,13 +36201,13 @@
       <PARA-START>820</PARA-START>
       <PARA-END>865</PARA-END>
     </M-EXT>
-    <M-SEC128>
+    <M-SEC131>
       <n>Глоссарий</n>
       <TYPE>NARRATIVE</TYPE>
-      <BOOKMARK>GRACE_M-SEC128</BOOKMARK>
+      <BOOKMARK>GRACE_M-SEC131</BOOKMARK>
       <PARA-START>866</PARA-START>
       <PARA-END>950</PARA-END>
-    </M-SEC128>
+    </M-SEC131>
     <M-VC>
       <n>Система управления версиями</n>
       <TYPE>MIXED</TYPE>
@@ -33549,17 +36255,17 @@
       <PARA-START>1131</PARA-START>
       <PARA-END>1161</PARA-END>
     </M-GIT>
-    <M-GIT34>
+    <M-GIT37>
       <n>Git</n>
       <TYPE>NARRATIVE</TYPE>
-      <BOOKMARK>GRACE_M-GIT34</BOOKMARK>
+      <BOOKMARK>GRACE_M-GIT37</BOOKMARK>
       <PARA-START>1162</PARA-START>
       <PARA-END>1192</PARA-END>
-    </M-GIT34>
-    <M-SEC135>
+    </M-GIT37>
+    <M-SEC138>
       <n>Команды</n>
       <TYPE>MIXED</TYPE>
-      <BOOKMARK>GRACE_M-SEC135</BOOKMARK>
+      <BOOKMARK>GRACE_M-SEC138</BOOKMARK>
       <PARA-START>1193</PARA-START>
       <PARA-END>1216</PARA-END>
       <ELEMENTS>
@@ -33568,7 +36274,7 @@
         <element type="TABLE-DATA" para-index="1196" columns="0" rows="0"/>
         <element type="TABLE-DATA" para-index="1197" columns="0" rows="0"/>
       </ELEMENTS>
-    </M-SEC135>
+    </M-SEC138>
     <M-SSH>
       <n>SSH</n>
       <TYPE>MIXED</TYPE>
@@ -33579,26 +36285,26 @@
         <element type="TABLE-DATA" para-index="1218" columns="0" rows="0"/>
       </ELEMENTS>
     </M-SSH>
-    <M-GIT37>
+    <M-GIT40>
       <n>Исключения Git</n>
       <TYPE>MIXED</TYPE>
-      <BOOKMARK>GRACE_M-GIT37</BOOKMARK>
+      <BOOKMARK>GRACE_M-GIT40</BOOKMARK>
       <PARA-START>1259</PARA-START>
       <PARA-END>1288</PARA-END>
       <ELEMENTS>
         <element type="TABLE-DATA" para-index="1260" columns="0" rows="0"/>
       </ELEMENTS>
-    </M-GIT37>
-    <M-GIT38>
+    </M-GIT40>
+    <M-GIT41>
       <n>Атрибуты Git</n>
       <TYPE>MIXED</TYPE>
-      <BOOKMARK>GRACE_M-GIT38</BOOKMARK>
+      <BOOKMARK>GRACE_M-GIT41</BOOKMARK>
       <PARA-START>1289</PARA-START>
       <PARA-END>1324</PARA-END>
       <ELEMENTS>
         <element type="TABLE-DATA" para-index="1290" columns="0" rows="0"/>
       </ELEMENTS>
-    </M-GIT38>
+    </M-GIT41>
     <M-LFS>
       <n>Git LFS</n>
       <TYPE>MIXED</TYPE>
@@ -33630,13 +36336,13 @@
         <element type="TABLE-DATA" para-index="1403" columns="0" rows="0"/>
       </ELEMENTS>
     </M-GITFLOW>
-    <M-SEC142>
+    <M-SEC145>
       <n>Принципы разработки</n>
       <TYPE>NARRATIVE</TYPE>
-      <BOOKMARK>GRACE_M-SEC142</BOOKMARK>
+      <BOOKMARK>GRACE_M-SEC145</BOOKMARK>
       <PARA-START>1467</PARA-START>
       <PARA-END>1481</PARA-END>
-    </M-SEC142>
+    </M-SEC145>
     <M-KISS>
       <n>KISS</n>
       <TYPE>NARRATIVE</TYPE>
@@ -33665,20 +36371,20 @@
       <PARA-START>1583</PARA-START>
       <PARA-END>1647</PARA-END>
     </M-SOLID>
-    <M-SEC147>
+    <M-SEC150>
       <n>Архитектура</n>
       <TYPE>NARRATIVE</TYPE>
-      <BOOKMARK>GRACE_M-SEC147</BOOKMARK>
+      <BOOKMARK>GRACE_M-SEC150</BOOKMARK>
       <PARA-START>1648</PARA-START>
       <PARA-END>1859</PARA-END>
-    </M-SEC147>
-    <M-SEC148>
+    </M-SEC150>
+    <M-SEC151>
       <n>Принципы разработки</n>
       <TYPE>NARRATIVE</TYPE>
-      <BOOKMARK>GRACE_M-SEC148</BOOKMARK>
+      <BOOKMARK>GRACE_M-SEC151</BOOKMARK>
       <PARA-START>1860</PARA-START>
       <PARA-END>1874</PARA-END>
-    </M-SEC148>
+    </M-SEC151>
     <M-INTEG>
       <n>Интеграции</n>
       <TYPE>NARRATIVE</TYPE>
@@ -33772,13 +36478,13 @@
         <element type="TABLE-DATA" para-index="2328" columns="0" rows="0"/>
       </ELEMENTS>
     </M-KAFKA-2>
-    <M-SEC161>
+    <M-SEC164>
       <n>Руководства</n>
       <TYPE>NARRATIVE</TYPE>
-      <BOOKMARK>GRACE_M-SEC161</BOOKMARK>
+      <BOOKMARK>GRACE_M-SEC164</BOOKMARK>
       <PARA-START>2343</PARA-START>
       <PARA-END>2369</PARA-END>
-    </M-SEC161>
+    </M-SEC164>
     <M-ENV>
       <n>Окружения</n>
       <TYPE>NARRATIVE</TYPE>
@@ -33800,13 +36506,13 @@
       <PARA-START>2433</PARA-START>
       <PARA-END>2452</PARA-END>
     </M-TASK>
-    <M-SEC165>
+    <M-SEC168>
       <n>Руководства</n>
       <TYPE>NARRATIVE</TYPE>
-      <BOOKMARK>GRACE_M-SEC165</BOOKMARK>
+      <BOOKMARK>GRACE_M-SEC168</BOOKMARK>
       <PARA-START>2453</PARA-START>
       <PARA-END>2479</PARA-END>
-    </M-SEC165>
+    </M-SEC168>
     <M-USERS>
       <n>users</n>
       <TYPE>NARRATIVE</TYPE>
@@ -33855,17 +36561,17 @@
         <element type="TABLE-DATA" para-index="2604" columns="0" rows="0"/>
       </ELEMENTS>
     </M-EDT>
-    <M-IDE71>
+    <M-IDE74>
       <n>IDE</n>
       <TYPE>DATA</TYPE>
-      <BOOKMARK>GRACE_M-IDE71</BOOKMARK>
+      <BOOKMARK>GRACE_M-IDE74</BOOKMARK>
       <PARA-START>2636</PARA-START>
       <PARA-END>2648</PARA-END>
       <ELEMENTS>
         <element type="TABLE-DATA" para-index="2637" columns="0" rows="0"/>
         <element type="TABLE-DATA" para-index="2638" columns="0" rows="0"/>
       </ELEMENTS>
-    </M-IDE71>
+    </M-IDE74>
     <M-DEVOPS>
       <n>DevOps</n>
       <TYPE>NARRATIVE</TYPE>
@@ -33957,13 +36663,13 @@
       <PARA-START>3002</PARA-START>
       <PARA-END>3011</PARA-END>
     </M-TESTI>
-    <M-SEC185>
+    <M-SEC188>
       <n>Стратегия автоматизированного тестирования</n>
       <TYPE>NARRATIVE</TYPE>
-      <BOOKMARK>GRACE_M-SEC185</BOOKMARK>
+      <BOOKMARK>GRACE_M-SEC188</BOOKMARK>
       <PARA-START>3012</PARA-START>
       <PARA-END>3067</PARA-END>
-    </M-SEC185>
+    </M-SEC188>
     <M-TESTDATA>
       <n>Инициализация тестовой ИБ</n>
       <TYPE>NARRATIVE</TYPE>
@@ -34058,12 +36764,12 @@
       <relation>contains: git → Система управления версиями</relation>
     </link>
     <link>
-      <from>M-GIT34</from>
+      <from>M-GIT37</from>
       <to>git</to>
       <relation>contains: Git → git</relation>
     </link>
     <link>
-      <from>M-SEC135</from>
+      <from>M-SEC138</from>
       <to>git</to>
       <relation>contains: Команды → git</relation>
     </link>
@@ -34073,12 +36779,12 @@
       <relation>contains: SSH → git</relation>
     </link>
     <link>
-      <from>M-GIT37</from>
+      <from>M-GIT40</from>
       <to>git</to>
       <relation>contains: Исключения Git → git</relation>
     </link>
     <link>
-      <from>M-GIT38</from>
+      <from>M-GIT41</from>
       <to>git</to>
       <relation>contains: Атрибуты Git → git</relation>
     </link>
@@ -34118,12 +36824,12 @@
       <relation>contains: SOLID → Принципы разработки</relation>
     </link>
     <link>
-      <from>M-SEC147</from>
+      <from>M-SEC150</from>
       <to>Принципы разработки</to>
       <relation>contains: Архитектура → Принципы разработки</relation>
     </link>
     <link>
-      <from>M-SEC148</from>
+      <from>M-SEC151</from>
       <to>Принципы разработки</to>
       <relation>contains: Принципы разработки → Принципы разработки</relation>
     </link>
@@ -34198,7 +36904,7 @@
       <relation>contains: Жизненный цикл задачи → Руководства</relation>
     </link>
     <link>
-      <from>M-SEC165</from>
+      <from>M-SEC168</from>
       <to>Руководства</to>
       <relation>contains: Руководства → Руководства</relation>
     </link>
@@ -34223,7 +36929,7 @@
       <relation>contains: 1С:EDT → IDE</relation>
     </link>
     <link>
-      <from>M-IDE71</from>
+      <from>M-IDE74</from>
       <to>IDE</to>
       <relation>contains: IDE → IDE</relation>
     </link>
@@ -34288,7 +36994,7 @@
       <relation>contains: testing → DevOps</relation>
     </link>
     <link>
-      <from>M-SEC185</from>
+      <from>M-SEC188</from>
       <to>testing</to>
       <relation>contains: Стратегия автоматизированного тестирования → testing</relation>
     </link>

</xml_diff>